<commit_message>
Fixes & Update report
</commit_message>
<xml_diff>
--- a/отчет.docx
+++ b/отчет.docx
@@ -43,10 +43,12 @@
           <w:sz w:val="26"/>
           <w:szCs w:val="26"/>
         </w:rPr>
-        <w:t xml:space="preserve">«ЛЭТИ» им. </w:t>
-      </w:r>
-      <w:proofErr w:type="spellStart"/>
-      <w:r>
+        <w:t>«ЛЭТИ» им. В.И.Ульянова (Ленина)»</w:t>
+      </w:r>
+    </w:p>
+    <w:p>
+      <w:pPr>
+        <w:jc w:val="center"/>
         <w:rPr>
           <w:rFonts w:cs="Times New Roman"/>
           <w:b/>
@@ -54,9 +56,7 @@
           <w:sz w:val="26"/>
           <w:szCs w:val="26"/>
         </w:rPr>
-        <w:t>В.И.Ульянова</w:t>
-      </w:r>
-      <w:proofErr w:type="spellEnd"/>
+      </w:pPr>
       <w:r>
         <w:rPr>
           <w:rFonts w:cs="Times New Roman"/>
@@ -65,51 +65,7 @@
           <w:sz w:val="26"/>
           <w:szCs w:val="26"/>
         </w:rPr>
-        <w:t xml:space="preserve"> (Ленина)»</w:t>
-      </w:r>
-    </w:p>
-    <w:p>
-      <w:pPr>
-        <w:jc w:val="center"/>
-        <w:rPr>
-          <w:rFonts w:cs="Times New Roman"/>
-          <w:b/>
-          <w:bCs/>
-          <w:sz w:val="26"/>
-          <w:szCs w:val="26"/>
-        </w:rPr>
-      </w:pPr>
-      <w:r>
-        <w:rPr>
-          <w:rFonts w:cs="Times New Roman"/>
-          <w:b/>
-          <w:bCs/>
-          <w:sz w:val="26"/>
-          <w:szCs w:val="26"/>
-        </w:rPr>
-        <w:t>(</w:t>
-      </w:r>
-      <w:proofErr w:type="spellStart"/>
-      <w:r>
-        <w:rPr>
-          <w:rFonts w:cs="Times New Roman"/>
-          <w:b/>
-          <w:bCs/>
-          <w:sz w:val="26"/>
-          <w:szCs w:val="26"/>
-        </w:rPr>
-        <w:t>СПбГЭТУ</w:t>
-      </w:r>
-      <w:proofErr w:type="spellEnd"/>
-      <w:r>
-        <w:rPr>
-          <w:rFonts w:cs="Times New Roman"/>
-          <w:b/>
-          <w:bCs/>
-          <w:sz w:val="26"/>
-          <w:szCs w:val="26"/>
-        </w:rPr>
-        <w:t xml:space="preserve"> «ЛЭТИ»)</w:t>
+        <w:t>(СПбГЭТУ «ЛЭТИ»)</w:t>
       </w:r>
     </w:p>
     <w:p>
@@ -321,7 +277,7 @@
         <w:rPr>
           <w:rFonts w:cs="Times New Roman"/>
           <w:caps/>
-          <w:color w:val="FF0000"/>
+          <w:color w:val="000000" w:themeColor="text1"/>
           <w:szCs w:val="28"/>
         </w:rPr>
       </w:pPr>
@@ -356,17 +312,8 @@
           <w:b/>
           <w:bCs/>
         </w:rPr>
-        <w:t xml:space="preserve">Решение </w:t>
-      </w:r>
-      <w:proofErr w:type="spellStart"/>
-      <w:r>
-        <w:rPr>
-          <w:b/>
-          <w:bCs/>
-        </w:rPr>
-        <w:t>судоку</w:t>
-      </w:r>
-      <w:proofErr w:type="spellEnd"/>
+        <w:t>Решение судоку</w:t>
+      </w:r>
     </w:p>
     <w:p>
       <w:pPr>
@@ -784,7 +731,6 @@
               </w:rPr>
               <w:t xml:space="preserve">. </w:t>
             </w:r>
-            <w:proofErr w:type="spellStart"/>
             <w:r>
               <w:rPr>
                 <w:rFonts w:cs="Times New Roman"/>
@@ -792,7 +738,6 @@
               </w:rPr>
               <w:t>Жангиров</w:t>
             </w:r>
-            <w:proofErr w:type="spellEnd"/>
           </w:p>
         </w:tc>
       </w:tr>
@@ -1130,13 +1075,8 @@
               <w:t xml:space="preserve">Тема практики: </w:t>
             </w:r>
             <w:r>
-              <w:t xml:space="preserve">Генетические алгоритмы. Решение </w:t>
-            </w:r>
-            <w:proofErr w:type="spellStart"/>
-            <w:r>
-              <w:t>судоку</w:t>
-            </w:r>
-            <w:proofErr w:type="spellEnd"/>
+              <w:t>Генетические алгоритмы. Решение судоку</w:t>
+            </w:r>
           </w:p>
         </w:tc>
       </w:tr>
@@ -1168,6 +1108,20 @@
             <w:pPr>
               <w:spacing w:line="360" w:lineRule="auto"/>
               <w:rPr>
+                <w:szCs w:val="28"/>
+              </w:rPr>
+            </w:pPr>
+            <w:r>
+              <w:rPr>
+                <w:szCs w:val="28"/>
+              </w:rPr>
+              <w:t>Решение судоку</w:t>
+            </w:r>
+          </w:p>
+          <w:p>
+            <w:pPr>
+              <w:spacing w:line="360" w:lineRule="auto"/>
+              <w:rPr>
                 <w:rFonts w:cs="Times New Roman"/>
                 <w:szCs w:val="28"/>
               </w:rPr>
@@ -1178,25 +1132,7 @@
                 <w:color w:val="000000"/>
                 <w:szCs w:val="28"/>
               </w:rPr>
-              <w:t xml:space="preserve">Для заданного игрового поля </w:t>
-            </w:r>
-            <w:proofErr w:type="spellStart"/>
-            <w:r>
-              <w:rPr>
-                <w:rFonts w:cs="Times New Roman"/>
-                <w:color w:val="000000"/>
-                <w:szCs w:val="28"/>
-              </w:rPr>
-              <w:t>судоку</w:t>
-            </w:r>
-            <w:proofErr w:type="spellEnd"/>
-            <w:r>
-              <w:rPr>
-                <w:rFonts w:cs="Times New Roman"/>
-                <w:color w:val="000000"/>
-                <w:szCs w:val="28"/>
-              </w:rPr>
-              <w:t>, где уже заданы некоторые цифры (размеры 9х9), необходимо разместить цифры от 1 до 9, так, чтобы они не нарушали правил.</w:t>
+              <w:t>Для заданного игрового поля судоку, где уже заданы цифры (размеры 9х9), необходимо разместить цифры от 1 до 9, так, чтобы они не нарушали правил.</w:t>
             </w:r>
           </w:p>
         </w:tc>
@@ -1313,39 +1249,49 @@
             <w:pPr>
               <w:spacing w:line="360" w:lineRule="auto"/>
               <w:rPr>
+                <w:color w:val="000000" w:themeColor="text1"/>
                 <w:szCs w:val="28"/>
               </w:rPr>
             </w:pPr>
             <w:r>
               <w:rPr>
+                <w:color w:val="000000" w:themeColor="text1"/>
                 <w:szCs w:val="28"/>
               </w:rPr>
               <w:t xml:space="preserve">Дата сдачи отчета: </w:t>
             </w:r>
             <w:r>
               <w:rPr>
-                <w:color w:val="EE0000"/>
+                <w:color w:val="000000" w:themeColor="text1"/>
                 <w:szCs w:val="28"/>
-              </w:rPr>
-              <w:t>00.0</w:t>
-            </w:r>
-            <w:r>
-              <w:rPr>
-                <w:color w:val="EE0000"/>
+                <w:lang w:val="en-US"/>
+              </w:rPr>
+              <w:t>14</w:t>
+            </w:r>
+            <w:r>
+              <w:rPr>
+                <w:color w:val="000000" w:themeColor="text1"/>
                 <w:szCs w:val="28"/>
               </w:rPr>
+              <w:t>.0</w:t>
+            </w:r>
+            <w:r>
+              <w:rPr>
+                <w:color w:val="000000" w:themeColor="text1"/>
+                <w:szCs w:val="28"/>
+              </w:rPr>
               <w:t>7</w:t>
             </w:r>
             <w:r>
               <w:rPr>
-                <w:color w:val="EE0000"/>
+                <w:color w:val="000000" w:themeColor="text1"/>
                 <w:szCs w:val="28"/>
               </w:rPr>
               <w:t>.</w:t>
             </w:r>
             <w:r>
               <w:rPr>
-                <w:color w:val="EE0000"/>
+                <w:color w:val="000000" w:themeColor="text1"/>
                 <w:szCs w:val="28"/>
               </w:rPr>
               <w:t>2026</w:t>
@@ -1367,39 +1313,49 @@
             <w:pPr>
               <w:spacing w:line="360" w:lineRule="auto"/>
               <w:rPr>
+                <w:color w:val="000000" w:themeColor="text1"/>
                 <w:szCs w:val="28"/>
               </w:rPr>
             </w:pPr>
             <w:r>
               <w:rPr>
+                <w:color w:val="000000" w:themeColor="text1"/>
                 <w:szCs w:val="28"/>
               </w:rPr>
               <w:t xml:space="preserve">Дата защиты отчета: </w:t>
             </w:r>
             <w:r>
               <w:rPr>
-                <w:color w:val="EE0000"/>
+                <w:color w:val="000000" w:themeColor="text1"/>
                 <w:szCs w:val="28"/>
-              </w:rPr>
-              <w:t>00.0</w:t>
-            </w:r>
-            <w:r>
-              <w:rPr>
-                <w:color w:val="EE0000"/>
+                <w:lang w:val="en-US"/>
+              </w:rPr>
+              <w:t>14</w:t>
+            </w:r>
+            <w:r>
+              <w:rPr>
+                <w:color w:val="000000" w:themeColor="text1"/>
                 <w:szCs w:val="28"/>
               </w:rPr>
+              <w:t>.0</w:t>
+            </w:r>
+            <w:r>
+              <w:rPr>
+                <w:color w:val="000000" w:themeColor="text1"/>
+                <w:szCs w:val="28"/>
+              </w:rPr>
               <w:t>7</w:t>
             </w:r>
             <w:r>
               <w:rPr>
-                <w:color w:val="EE0000"/>
+                <w:color w:val="000000" w:themeColor="text1"/>
                 <w:szCs w:val="28"/>
               </w:rPr>
               <w:t>.</w:t>
             </w:r>
             <w:r>
               <w:rPr>
-                <w:color w:val="EE0000"/>
+                <w:color w:val="000000" w:themeColor="text1"/>
                 <w:szCs w:val="28"/>
               </w:rPr>
               <w:t>2026</w:t>
@@ -1583,17 +1539,8 @@
                 <w:rFonts w:cs="Times New Roman"/>
                 <w:szCs w:val="28"/>
               </w:rPr>
-              <w:t xml:space="preserve">Т.Р. </w:t>
-            </w:r>
-            <w:proofErr w:type="spellStart"/>
-            <w:r>
-              <w:rPr>
-                <w:rFonts w:cs="Times New Roman"/>
-                <w:szCs w:val="28"/>
-              </w:rPr>
-              <w:t>Жангиров</w:t>
-            </w:r>
-            <w:proofErr w:type="spellEnd"/>
+              <w:t>Т.Р. Жангиров</w:t>
+            </w:r>
           </w:p>
         </w:tc>
       </w:tr>
@@ -1634,90 +1581,94 @@
     <w:p>
       <w:pPr>
         <w:pStyle w:val="a1"/>
-      </w:pPr>
-      <w:r>
-        <w:t>Краткое изложение содержания отчёта.</w:t>
-      </w:r>
-    </w:p>
-    <w:p>
-      <w:pPr>
-        <w:pStyle w:val="a1"/>
-      </w:pPr>
-    </w:p>
-    <w:p>
-      <w:pPr>
-        <w:pStyle w:val="a1"/>
-      </w:pPr>
-    </w:p>
-    <w:p>
-      <w:pPr>
-        <w:pStyle w:val="a1"/>
-      </w:pPr>
-    </w:p>
-    <w:p>
-      <w:pPr>
-        <w:pStyle w:val="a1"/>
-      </w:pPr>
-    </w:p>
-    <w:p>
-      <w:pPr>
-        <w:pStyle w:val="a1"/>
-      </w:pPr>
-    </w:p>
-    <w:p>
-      <w:pPr>
-        <w:pStyle w:val="a1"/>
-      </w:pPr>
-    </w:p>
-    <w:p>
-      <w:pPr>
-        <w:pStyle w:val="a1"/>
-      </w:pPr>
-    </w:p>
-    <w:p>
-      <w:pPr>
-        <w:pStyle w:val="a1"/>
-      </w:pPr>
-    </w:p>
-    <w:p>
-      <w:pPr>
-        <w:pStyle w:val="a1"/>
-      </w:pPr>
-    </w:p>
-    <w:p>
-      <w:pPr>
-        <w:pStyle w:val="a1"/>
-      </w:pPr>
-    </w:p>
-    <w:p>
-      <w:pPr>
-        <w:pStyle w:val="a1"/>
-      </w:pPr>
-    </w:p>
-    <w:p>
-      <w:pPr>
-        <w:pStyle w:val="a1"/>
-      </w:pPr>
-    </w:p>
-    <w:p>
-      <w:pPr>
-        <w:pStyle w:val="a1"/>
-      </w:pPr>
-    </w:p>
-    <w:p>
-      <w:pPr>
-        <w:pStyle w:val="a1"/>
-        <w:ind w:firstLine="0"/>
+        <w:ind w:left="708"/>
+      </w:pPr>
+      <w:r>
+        <w:t xml:space="preserve">В </w:t>
+      </w:r>
+      <w:r>
+        <w:t xml:space="preserve">представленном </w:t>
+      </w:r>
+      <w:r>
+        <w:t>отчёте описана разработка программы для решения судоку с помощью генетического алгоритма. Рассмотрены структура алгоритма, способы представления и оценки решений, а также реализация графического интерфейса. Разработанная программа позволяет настраивать параметры алгоритма и наблюдать процесс поиска решения.</w:t>
+      </w:r>
+    </w:p>
+    <w:p>
+      <w:pPr>
+        <w:pStyle w:val="a1"/>
+      </w:pPr>
+    </w:p>
+    <w:p>
+      <w:pPr>
+        <w:pStyle w:val="a1"/>
+      </w:pPr>
+    </w:p>
+    <w:p>
+      <w:pPr>
+        <w:pStyle w:val="a1"/>
+      </w:pPr>
+    </w:p>
+    <w:p>
+      <w:pPr>
+        <w:pStyle w:val="a1"/>
+      </w:pPr>
+    </w:p>
+    <w:p>
+      <w:pPr>
+        <w:pStyle w:val="a1"/>
+      </w:pPr>
+    </w:p>
+    <w:p>
+      <w:pPr>
+        <w:pStyle w:val="a1"/>
+      </w:pPr>
+    </w:p>
+    <w:p>
+      <w:pPr>
+        <w:pStyle w:val="a1"/>
+      </w:pPr>
+    </w:p>
+    <w:p>
+      <w:pPr>
+        <w:pStyle w:val="a1"/>
+      </w:pPr>
+    </w:p>
+    <w:p>
+      <w:pPr>
+        <w:pStyle w:val="a1"/>
+      </w:pPr>
+    </w:p>
+    <w:p>
+      <w:pPr>
+        <w:pStyle w:val="a1"/>
+      </w:pPr>
+    </w:p>
+    <w:p>
+      <w:pPr>
+        <w:pStyle w:val="a1"/>
+      </w:pPr>
+    </w:p>
+    <w:p>
+      <w:pPr>
+        <w:pStyle w:val="a1"/>
+      </w:pPr>
+    </w:p>
+    <w:p>
+      <w:pPr>
+        <w:pStyle w:val="a1"/>
+        <w:ind w:left="708" w:firstLine="0"/>
         <w:jc w:val="center"/>
         <w:rPr>
           <w:b/>
           <w:bCs/>
+          <w:lang w:val="en-US"/>
         </w:rPr>
       </w:pPr>
       <w:r>
         <w:rPr>
           <w:b/>
           <w:bCs/>
+          <w:lang w:val="en-US"/>
         </w:rPr>
         <w:t>S</w:t>
       </w:r>
@@ -1733,11 +1684,21 @@
     <w:p>
       <w:pPr>
         <w:pStyle w:val="a1"/>
-      </w:pPr>
-      <w:r>
-        <w:t>Аннотация на английском языке.</w:t>
-      </w:r>
-      <w:r>
+        <w:ind w:left="708"/>
+        <w:rPr>
+          <w:lang w:val="en-US"/>
+        </w:rPr>
+      </w:pPr>
+      <w:r>
+        <w:rPr>
+          <w:lang w:val="en-US"/>
+        </w:rPr>
+        <w:t>The report describes the development of a program for solving Sudoku using a genetic algorithm. It covers the algorithm structure, methods for representing and evaluating solutions, and the implementation of a graphical user interface. The program allows users to configure the algorithm parameters and monitor the solution process.</w:t>
+      </w:r>
+      <w:r>
+        <w:rPr>
+          <w:lang w:val="en-US"/>
+        </w:rPr>
         <w:br w:type="page"/>
       </w:r>
     </w:p>
@@ -1748,6 +1709,7 @@
         <w:rPr>
           <w:rFonts w:cs="Times New Roman"/>
           <w:b/>
+          <w:lang w:val="en-US"/>
         </w:rPr>
       </w:pPr>
       <w:r>
@@ -1800,7 +1762,7 @@
             </w:rPr>
             <w:fldChar w:fldCharType="separate"/>
           </w:r>
-          <w:hyperlink w:anchor="_Toc234401999" w:history="1">
+          <w:hyperlink w:anchor="_Toc234882179" w:history="1">
             <w:r>
               <w:rPr>
                 <w:rStyle w:val="a7"/>
@@ -1828,7 +1790,7 @@
                 <w:noProof/>
                 <w:webHidden/>
               </w:rPr>
-              <w:instrText xml:space="preserve"> PAGEREF _Toc234401999 \h </w:instrText>
+              <w:instrText xml:space="preserve"> PAGEREF _Toc234882179 \h </w:instrText>
             </w:r>
             <w:r>
               <w:rPr>
@@ -1870,7 +1832,7 @@
               <w:lang w:eastAsia="ru-RU" w:bidi="ar-SA"/>
             </w:rPr>
           </w:pPr>
-          <w:hyperlink w:anchor="_Toc234402000" w:history="1">
+          <w:hyperlink w:anchor="_Toc234882180" w:history="1">
             <w:r>
               <w:rPr>
                 <w:rStyle w:val="a7"/>
@@ -1897,7 +1859,7 @@
                 <w:noProof/>
                 <w:webHidden/>
               </w:rPr>
-              <w:instrText xml:space="preserve"> PAGEREF _Toc234402000 \h </w:instrText>
+              <w:instrText xml:space="preserve"> PAGEREF _Toc234882180 \h </w:instrText>
             </w:r>
             <w:r>
               <w:rPr>
@@ -1939,7 +1901,7 @@
               <w:lang w:eastAsia="ru-RU" w:bidi="ar-SA"/>
             </w:rPr>
           </w:pPr>
-          <w:hyperlink w:anchor="_Toc234402001" w:history="1">
+          <w:hyperlink w:anchor="_Toc234882181" w:history="1">
             <w:r>
               <w:rPr>
                 <w:rStyle w:val="a7"/>
@@ -1966,7 +1928,7 @@
                 <w:noProof/>
                 <w:webHidden/>
               </w:rPr>
-              <w:instrText xml:space="preserve"> PAGEREF _Toc234402001 \h </w:instrText>
+              <w:instrText xml:space="preserve"> PAGEREF _Toc234882181 \h </w:instrText>
             </w:r>
             <w:r>
               <w:rPr>
@@ -2008,7 +1970,7 @@
               <w:lang w:eastAsia="ru-RU" w:bidi="ar-SA"/>
             </w:rPr>
           </w:pPr>
-          <w:hyperlink w:anchor="_Toc234402002" w:history="1">
+          <w:hyperlink w:anchor="_Toc234882182" w:history="1">
             <w:r>
               <w:rPr>
                 <w:rStyle w:val="a7"/>
@@ -2035,7 +1997,7 @@
                 <w:noProof/>
                 <w:webHidden/>
               </w:rPr>
-              <w:instrText xml:space="preserve"> PAGEREF _Toc234402002 \h </w:instrText>
+              <w:instrText xml:space="preserve"> PAGEREF _Toc234882182 \h </w:instrText>
             </w:r>
             <w:r>
               <w:rPr>
@@ -2077,7 +2039,7 @@
               <w:lang w:eastAsia="ru-RU" w:bidi="ar-SA"/>
             </w:rPr>
           </w:pPr>
-          <w:hyperlink w:anchor="_Toc234402003" w:history="1">
+          <w:hyperlink w:anchor="_Toc234882183" w:history="1">
             <w:r>
               <w:rPr>
                 <w:rStyle w:val="a7"/>
@@ -2104,7 +2066,7 @@
                 <w:noProof/>
                 <w:webHidden/>
               </w:rPr>
-              <w:instrText xml:space="preserve"> PAGEREF _Toc234402003 \h </w:instrText>
+              <w:instrText xml:space="preserve"> PAGEREF _Toc234882183 \h </w:instrText>
             </w:r>
             <w:r>
               <w:rPr>
@@ -2146,7 +2108,7 @@
               <w:lang w:eastAsia="ru-RU" w:bidi="ar-SA"/>
             </w:rPr>
           </w:pPr>
-          <w:hyperlink w:anchor="_Toc234402004" w:history="1">
+          <w:hyperlink w:anchor="_Toc234882184" w:history="1">
             <w:r>
               <w:rPr>
                 <w:rStyle w:val="a7"/>
@@ -2173,7 +2135,7 @@
                 <w:noProof/>
                 <w:webHidden/>
               </w:rPr>
-              <w:instrText xml:space="preserve"> PAGEREF _Toc234402004 \h </w:instrText>
+              <w:instrText xml:space="preserve"> PAGEREF _Toc234882184 \h </w:instrText>
             </w:r>
             <w:r>
               <w:rPr>
@@ -2215,7 +2177,7 @@
               <w:lang w:eastAsia="ru-RU" w:bidi="ar-SA"/>
             </w:rPr>
           </w:pPr>
-          <w:hyperlink w:anchor="_Toc234402005" w:history="1">
+          <w:hyperlink w:anchor="_Toc234882185" w:history="1">
             <w:r>
               <w:rPr>
                 <w:rStyle w:val="a7"/>
@@ -2242,7 +2204,7 @@
                 <w:noProof/>
                 <w:webHidden/>
               </w:rPr>
-              <w:instrText xml:space="preserve"> PAGEREF _Toc234402005 \h </w:instrText>
+              <w:instrText xml:space="preserve"> PAGEREF _Toc234882185 \h </w:instrText>
             </w:r>
             <w:r>
               <w:rPr>
@@ -2284,7 +2246,7 @@
               <w:lang w:eastAsia="ru-RU" w:bidi="ar-SA"/>
             </w:rPr>
           </w:pPr>
-          <w:hyperlink w:anchor="_Toc234402006" w:history="1">
+          <w:hyperlink w:anchor="_Toc234882186" w:history="1">
             <w:r>
               <w:rPr>
                 <w:rStyle w:val="a7"/>
@@ -2311,7 +2273,7 @@
                 <w:noProof/>
                 <w:webHidden/>
               </w:rPr>
-              <w:instrText xml:space="preserve"> PAGEREF _Toc234402006 \h </w:instrText>
+              <w:instrText xml:space="preserve"> PAGEREF _Toc234882186 \h </w:instrText>
             </w:r>
             <w:r>
               <w:rPr>
@@ -2353,7 +2315,7 @@
               <w:lang w:eastAsia="ru-RU" w:bidi="ar-SA"/>
             </w:rPr>
           </w:pPr>
-          <w:hyperlink w:anchor="_Toc234402007" w:history="1">
+          <w:hyperlink w:anchor="_Toc234882187" w:history="1">
             <w:r>
               <w:rPr>
                 <w:rStyle w:val="a7"/>
@@ -2380,7 +2342,7 @@
                 <w:noProof/>
                 <w:webHidden/>
               </w:rPr>
-              <w:instrText xml:space="preserve"> PAGEREF _Toc234402007 \h </w:instrText>
+              <w:instrText xml:space="preserve"> PAGEREF _Toc234882187 \h </w:instrText>
             </w:r>
             <w:r>
               <w:rPr>
@@ -2422,7 +2384,7 @@
               <w:lang w:eastAsia="ru-RU" w:bidi="ar-SA"/>
             </w:rPr>
           </w:pPr>
-          <w:hyperlink w:anchor="_Toc234402008" w:history="1">
+          <w:hyperlink w:anchor="_Toc234882188" w:history="1">
             <w:r>
               <w:rPr>
                 <w:rStyle w:val="a7"/>
@@ -2449,7 +2411,7 @@
                 <w:noProof/>
                 <w:webHidden/>
               </w:rPr>
-              <w:instrText xml:space="preserve"> PAGEREF _Toc234402008 \h </w:instrText>
+              <w:instrText xml:space="preserve"> PAGEREF _Toc234882188 \h </w:instrText>
             </w:r>
             <w:r>
               <w:rPr>
@@ -2491,7 +2453,7 @@
               <w:lang w:eastAsia="ru-RU" w:bidi="ar-SA"/>
             </w:rPr>
           </w:pPr>
-          <w:hyperlink w:anchor="_Toc234402009" w:history="1">
+          <w:hyperlink w:anchor="_Toc234882189" w:history="1">
             <w:r>
               <w:rPr>
                 <w:rStyle w:val="a7"/>
@@ -2518,7 +2480,7 @@
                 <w:noProof/>
                 <w:webHidden/>
               </w:rPr>
-              <w:instrText xml:space="preserve"> PAGEREF _Toc234402009 \h </w:instrText>
+              <w:instrText xml:space="preserve"> PAGEREF _Toc234882189 \h </w:instrText>
             </w:r>
             <w:r>
               <w:rPr>
@@ -2560,13 +2522,13 @@
               <w:lang w:eastAsia="ru-RU" w:bidi="ar-SA"/>
             </w:rPr>
           </w:pPr>
-          <w:hyperlink w:anchor="_Toc234402010" w:history="1">
+          <w:hyperlink w:anchor="_Toc234882190" w:history="1">
             <w:r>
               <w:rPr>
                 <w:rStyle w:val="a7"/>
                 <w:noProof/>
               </w:rPr>
-              <w:t>2.7. Тестирование программы</w:t>
+              <w:t>2.7. Реализация графического интерфейса программы</w:t>
             </w:r>
             <w:r>
               <w:rPr>
@@ -2587,7 +2549,7 @@
                 <w:noProof/>
                 <w:webHidden/>
               </w:rPr>
-              <w:instrText xml:space="preserve"> PAGEREF _Toc234402010 \h </w:instrText>
+              <w:instrText xml:space="preserve"> PAGEREF _Toc234882190 \h </w:instrText>
             </w:r>
             <w:r>
               <w:rPr>
@@ -2607,7 +2569,7 @@
                 <w:noProof/>
                 <w:webHidden/>
               </w:rPr>
-              <w:t>12</w:t>
+              <w:t>14</w:t>
             </w:r>
             <w:r>
               <w:rPr>
@@ -2629,13 +2591,13 @@
               <w:lang w:eastAsia="ru-RU" w:bidi="ar-SA"/>
             </w:rPr>
           </w:pPr>
-          <w:hyperlink w:anchor="_Toc234402011" w:history="1">
+          <w:hyperlink w:anchor="_Toc234882191" w:history="1">
             <w:r>
               <w:rPr>
                 <w:rStyle w:val="a7"/>
                 <w:noProof/>
               </w:rPr>
-              <w:t>2.8. Создание отчета</w:t>
+              <w:t>2.8. Тестирование программы</w:t>
             </w:r>
             <w:r>
               <w:rPr>
@@ -2656,7 +2618,7 @@
                 <w:noProof/>
                 <w:webHidden/>
               </w:rPr>
-              <w:instrText xml:space="preserve"> PAGEREF _Toc234402011 \h </w:instrText>
+              <w:instrText xml:space="preserve"> PAGEREF _Toc234882191 \h </w:instrText>
             </w:r>
             <w:r>
               <w:rPr>
@@ -2676,7 +2638,7 @@
                 <w:noProof/>
                 <w:webHidden/>
               </w:rPr>
-              <w:t>12</w:t>
+              <w:t>16</w:t>
             </w:r>
             <w:r>
               <w:rPr>
@@ -2698,7 +2660,7 @@
               <w:lang w:eastAsia="ru-RU" w:bidi="ar-SA"/>
             </w:rPr>
           </w:pPr>
-          <w:hyperlink w:anchor="_Toc234402012" w:history="1">
+          <w:hyperlink w:anchor="_Toc234882192" w:history="1">
             <w:r>
               <w:rPr>
                 <w:rStyle w:val="a7"/>
@@ -2725,7 +2687,7 @@
                 <w:noProof/>
                 <w:webHidden/>
               </w:rPr>
-              <w:instrText xml:space="preserve"> PAGEREF _Toc234402012 \h </w:instrText>
+              <w:instrText xml:space="preserve"> PAGEREF _Toc234882192 \h </w:instrText>
             </w:r>
             <w:r>
               <w:rPr>
@@ -2745,7 +2707,7 @@
                 <w:noProof/>
                 <w:webHidden/>
               </w:rPr>
-              <w:t>13</w:t>
+              <w:t>17</w:t>
             </w:r>
             <w:r>
               <w:rPr>
@@ -2767,7 +2729,7 @@
               <w:lang w:eastAsia="ru-RU" w:bidi="ar-SA"/>
             </w:rPr>
           </w:pPr>
-          <w:hyperlink w:anchor="_Toc234402013" w:history="1">
+          <w:hyperlink w:anchor="_Toc234882193" w:history="1">
             <w:r>
               <w:rPr>
                 <w:rStyle w:val="a7"/>
@@ -2794,7 +2756,7 @@
                 <w:noProof/>
                 <w:webHidden/>
               </w:rPr>
-              <w:instrText xml:space="preserve"> PAGEREF _Toc234402013 \h </w:instrText>
+              <w:instrText xml:space="preserve"> PAGEREF _Toc234882193 \h </w:instrText>
             </w:r>
             <w:r>
               <w:rPr>
@@ -2814,7 +2776,7 @@
                 <w:noProof/>
                 <w:webHidden/>
               </w:rPr>
-              <w:t>14</w:t>
+              <w:t>18</w:t>
             </w:r>
             <w:r>
               <w:rPr>
@@ -2836,7 +2798,7 @@
               <w:lang w:eastAsia="ru-RU" w:bidi="ar-SA"/>
             </w:rPr>
           </w:pPr>
-          <w:hyperlink w:anchor="_Toc234402014" w:history="1">
+          <w:hyperlink w:anchor="_Toc234882194" w:history="1">
             <w:r>
               <w:rPr>
                 <w:rStyle w:val="a7"/>
@@ -2863,7 +2825,7 @@
                 <w:noProof/>
                 <w:webHidden/>
               </w:rPr>
-              <w:instrText xml:space="preserve"> PAGEREF _Toc234402014 \h </w:instrText>
+              <w:instrText xml:space="preserve"> PAGEREF _Toc234882194 \h </w:instrText>
             </w:r>
             <w:r>
               <w:rPr>
@@ -2883,7 +2845,7 @@
                 <w:noProof/>
                 <w:webHidden/>
               </w:rPr>
-              <w:t>15</w:t>
+              <w:t>19</w:t>
             </w:r>
             <w:r>
               <w:rPr>
@@ -2905,7 +2867,7 @@
               <w:lang w:eastAsia="ru-RU" w:bidi="ar-SA"/>
             </w:rPr>
           </w:pPr>
-          <w:hyperlink w:anchor="_Toc234402015" w:history="1">
+          <w:hyperlink w:anchor="_Toc234882195" w:history="1">
             <w:r>
               <w:rPr>
                 <w:rStyle w:val="a7"/>
@@ -2933,7 +2895,7 @@
                 <w:noProof/>
                 <w:webHidden/>
               </w:rPr>
-              <w:instrText xml:space="preserve"> PAGEREF _Toc234402015 \h </w:instrText>
+              <w:instrText xml:space="preserve"> PAGEREF _Toc234882195 \h </w:instrText>
             </w:r>
             <w:r>
               <w:rPr>
@@ -2953,77 +2915,7 @@
                 <w:noProof/>
                 <w:webHidden/>
               </w:rPr>
-              <w:t>16</w:t>
-            </w:r>
-            <w:r>
-              <w:rPr>
-                <w:noProof/>
-                <w:webHidden/>
-              </w:rPr>
-              <w:fldChar w:fldCharType="end"/>
-            </w:r>
-          </w:hyperlink>
-        </w:p>
-        <w:p>
-          <w:pPr>
-            <w:pStyle w:val="20"/>
-            <w:rPr>
-              <w:rFonts w:asciiTheme="minorHAnsi" w:eastAsiaTheme="minorEastAsia" w:hAnsiTheme="minorHAnsi" w:cstheme="minorBidi"/>
-              <w:noProof/>
-              <w:sz w:val="22"/>
-              <w:szCs w:val="22"/>
-              <w:lang w:eastAsia="ru-RU" w:bidi="ar-SA"/>
-            </w:rPr>
-          </w:pPr>
-          <w:hyperlink w:anchor="_Toc234402016" w:history="1">
-            <w:r>
-              <w:rPr>
-                <w:rStyle w:val="a7"/>
-                <w:rFonts w:cs="Times New Roman"/>
-                <w:noProof/>
-              </w:rPr>
-              <w:t>ПРИЛОЖЕНИЕ А</w:t>
-            </w:r>
-            <w:r>
-              <w:rPr>
-                <w:noProof/>
-                <w:webHidden/>
-              </w:rPr>
-              <w:tab/>
-            </w:r>
-            <w:r>
-              <w:rPr>
-                <w:noProof/>
-                <w:webHidden/>
-              </w:rPr>
-              <w:fldChar w:fldCharType="begin"/>
-            </w:r>
-            <w:r>
-              <w:rPr>
-                <w:noProof/>
-                <w:webHidden/>
-              </w:rPr>
-              <w:instrText xml:space="preserve"> PAGEREF _Toc234402016 \h </w:instrText>
-            </w:r>
-            <w:r>
-              <w:rPr>
-                <w:noProof/>
-                <w:webHidden/>
-              </w:rPr>
-            </w:r>
-            <w:r>
-              <w:rPr>
-                <w:noProof/>
-                <w:webHidden/>
-              </w:rPr>
-              <w:fldChar w:fldCharType="separate"/>
-            </w:r>
-            <w:r>
-              <w:rPr>
-                <w:noProof/>
-                <w:webHidden/>
-              </w:rPr>
-              <w:t>17</w:t>
+              <w:t>20</w:t>
             </w:r>
             <w:r>
               <w:rPr>
@@ -3071,7 +2963,7 @@
           <w:rFonts w:cs="Times New Roman"/>
         </w:rPr>
       </w:pPr>
-      <w:bookmarkStart w:id="0" w:name="_Toc234401999"/>
+      <w:bookmarkStart w:id="0" w:name="_Toc234882179"/>
       <w:r>
         <w:rPr>
           <w:rFonts w:cs="Times New Roman"/>
@@ -3087,21 +2979,7 @@
       </w:pPr>
       <w:bookmarkStart w:id="1" w:name="_Toc73173348"/>
       <w:r>
-        <w:t>Предметной областью данной работы является разработка програм</w:t>
-      </w:r>
-      <w:r>
-        <w:t>мы</w:t>
-      </w:r>
-      <w:r>
-        <w:t xml:space="preserve"> для решения задач при помощи генетических алгоритмов. В качестве практического примера рассматривалась задача решения </w:t>
-      </w:r>
-      <w:proofErr w:type="spellStart"/>
-      <w:r>
-        <w:t>судоку</w:t>
-      </w:r>
-      <w:proofErr w:type="spellEnd"/>
-      <w:r>
-        <w:t xml:space="preserve"> с набором заранее размещенных цифр.</w:t>
+        <w:t xml:space="preserve">Генетические алгоритмы применяются для поиска решений в оптимизационных задачах с большим числом возможных вариантов. Целью данной работы является разработка программы, демонстрирующей решение судоку при помощи генетического алгоритма. В ходе работы были изучены основные принципы работы генетических алгоритмов, разработаны способы представления и оценки решений, реализованы компоненты для инициализации, отбора, скрещивания и мутации особей, а также создан графический интерфейс для настройки параметров алгоритма и наблюдения за процессом решения. </w:t>
       </w:r>
       <w:r>
         <w:br w:type="page"/>
@@ -3115,7 +2993,7 @@
           <w:numId w:val="2"/>
         </w:numPr>
       </w:pPr>
-      <w:bookmarkStart w:id="2" w:name="_Toc234402000"/>
+      <w:bookmarkStart w:id="2" w:name="_Toc234882180"/>
       <w:r>
         <w:lastRenderedPageBreak/>
         <w:t xml:space="preserve">1 </w:t>
@@ -3134,19 +3012,19 @@
           <w:numId w:val="2"/>
         </w:numPr>
       </w:pPr>
-      <w:bookmarkStart w:id="3" w:name="_Toc73173349"/>
-      <w:bookmarkStart w:id="4" w:name="_Toc234402001"/>
+      <w:bookmarkStart w:id="3" w:name="_Toc234882181"/>
+      <w:bookmarkStart w:id="4" w:name="_Toc73173349"/>
       <w:r>
         <w:t>1.1 Предметная область</w:t>
       </w:r>
-      <w:bookmarkEnd w:id="4"/>
-    </w:p>
-    <w:p>
-      <w:pPr>
-        <w:pStyle w:val="a1"/>
-      </w:pPr>
-      <w:r>
-        <w:t>Опишите кратко область практики и ваших задач: где и как используют изученные вами технологии, как и кому могут пригодиться выполненные вами задачи и так далее.</w:t>
+      <w:bookmarkEnd w:id="3"/>
+    </w:p>
+    <w:p>
+      <w:pPr>
+        <w:pStyle w:val="a1"/>
+      </w:pPr>
+      <w:r>
+        <w:t>Предметной областью данной работы является разработка программы для решения задач при помощи генетических алгоритмов. В качестве практического примера рассматривалась задача решения судоку с набором заранее размещенных цифр.</w:t>
       </w:r>
     </w:p>
     <w:p>
@@ -3157,7 +3035,7 @@
           <w:numId w:val="2"/>
         </w:numPr>
       </w:pPr>
-      <w:bookmarkStart w:id="5" w:name="_Toc234402002"/>
+      <w:bookmarkStart w:id="5" w:name="_Toc234882182"/>
       <w:r>
         <w:t>1.2 Задачи практики</w:t>
       </w:r>
@@ -3168,15 +3046,7 @@
         <w:pStyle w:val="a1"/>
       </w:pPr>
       <w:r>
-        <w:t xml:space="preserve">Основной целью данной работы является разработка приложения, демонстрирующего работу генетического алгоритма на примере решения </w:t>
-      </w:r>
-      <w:proofErr w:type="spellStart"/>
-      <w:r>
-        <w:t>судоку</w:t>
-      </w:r>
-      <w:proofErr w:type="spellEnd"/>
-      <w:r>
-        <w:t>.</w:t>
+        <w:t>Основной целью данной работы является разработка приложения, демонстрирующего работу генетического алгоритма на примере решения судоку.</w:t>
       </w:r>
       <w:r>
         <w:br/>
@@ -3213,13 +3083,8 @@
         </w:numPr>
       </w:pPr>
       <w:r>
-        <w:t xml:space="preserve">Изучение особенностей задачи решения </w:t>
-      </w:r>
-      <w:proofErr w:type="spellStart"/>
-      <w:r>
-        <w:t>судоку</w:t>
-      </w:r>
-      <w:proofErr w:type="spellEnd"/>
+        <w:t>Изучение особенностей задачи решения судоку</w:t>
+      </w:r>
     </w:p>
     <w:p>
       <w:pPr>
@@ -3278,7 +3143,7 @@
         </w:numPr>
       </w:pPr>
       <w:r>
-        <w:t>Тестирование программы</w:t>
+        <w:t>Реализация графического интерфейса программы</w:t>
       </w:r>
     </w:p>
     <w:p>
@@ -3290,10 +3155,10 @@
         </w:numPr>
       </w:pPr>
       <w:r>
-        <w:t>Создание отчета</w:t>
-      </w:r>
-    </w:p>
-    <w:bookmarkEnd w:id="3"/>
+        <w:t>Тестирование программы</w:t>
+      </w:r>
+    </w:p>
+    <w:bookmarkEnd w:id="4"/>
     <w:p>
       <w:pPr>
         <w:jc w:val="left"/>
@@ -3327,7 +3192,7 @@
         <w:pStyle w:val="2"/>
         <w:ind w:left="0"/>
       </w:pPr>
-      <w:bookmarkStart w:id="6" w:name="_Toc234402003"/>
+      <w:bookmarkStart w:id="6" w:name="_Toc234882183"/>
       <w:r>
         <w:t>2 РЕЗУЛЬТАТЫ РАБОТЫ</w:t>
       </w:r>
@@ -3344,7 +3209,7 @@
           <w:numId w:val="2"/>
         </w:numPr>
       </w:pPr>
-      <w:bookmarkStart w:id="7" w:name="_Toc234402004"/>
+      <w:bookmarkStart w:id="7" w:name="_Toc234882184"/>
       <w:r>
         <w:t xml:space="preserve">2.1. </w:t>
       </w:r>
@@ -3358,36 +3223,36 @@
         <w:pStyle w:val="a1"/>
       </w:pPr>
       <w:r>
-        <w:t xml:space="preserve">На данном этапе были изучены основы работы генетических алгоритмов и их применение для решения задач оптимизации.  Рассмотрены механизмы представления хромосомы, скрещивания, мутации, методы отбора, жесткие и мягкие ограничения, а </w:t>
-      </w:r>
-      <w:proofErr w:type="gramStart"/>
-      <w:r>
-        <w:t>так же</w:t>
-      </w:r>
-      <w:proofErr w:type="gramEnd"/>
-      <w:r>
-        <w:t xml:space="preserve"> преимущества и недостатки различных способов реализации данных механизмов.</w:t>
-      </w:r>
-    </w:p>
-    <w:p>
-      <w:pPr>
-        <w:pStyle w:val="a1"/>
-      </w:pPr>
-      <w:r>
-        <w:rPr>
-          <w:lang w:eastAsia="ru-RU" w:bidi="ar-SA"/>
-        </w:rPr>
+        <w:t>На данном этапе были изучены основы работы генетических алгоритмов и их применение для решения задач оптимизации.</w:t>
+      </w:r>
+      <w:r>
+        <w:t xml:space="preserve"> В качестве основного источника использовалось учебно-методическое пособие Т. В. Панченко </w:t>
+      </w:r>
+      <w:r>
+        <w:t>[1]</w:t>
+      </w:r>
+      <w:r>
+        <w:t>.</w:t>
+      </w:r>
+      <w:r>
+        <w:t xml:space="preserve">  Рассмотрены механизмы представления хромосомы, скрещивания, мутации, методы отбора, жесткие и мягкие ограничения, а также преимущества и недостатки различных способов реализации данных механизмов.</w:t>
+      </w:r>
+    </w:p>
+    <w:p>
+      <w:pPr>
+        <w:pStyle w:val="a1"/>
+      </w:pPr>
+      <w:r>
         <w:t>В результате были определены основные этапы работы генетического алгоритма, которые необходимо реализовать в программе:</w:t>
       </w:r>
     </w:p>
     <w:p>
       <w:pPr>
-        <w:pStyle w:val="af8"/>
+        <w:pStyle w:val="a1"/>
         <w:numPr>
           <w:ilvl w:val="0"/>
-          <w:numId w:val="11"/>
+          <w:numId w:val="19"/>
         </w:numPr>
-        <w:spacing w:line="360" w:lineRule="auto"/>
         <w:rPr>
           <w:lang w:eastAsia="ru-RU" w:bidi="ar-SA"/>
         </w:rPr>
@@ -3401,12 +3266,11 @@
     </w:p>
     <w:p>
       <w:pPr>
-        <w:pStyle w:val="af8"/>
+        <w:pStyle w:val="a1"/>
         <w:numPr>
           <w:ilvl w:val="0"/>
-          <w:numId w:val="11"/>
+          <w:numId w:val="19"/>
         </w:numPr>
-        <w:spacing w:line="360" w:lineRule="auto"/>
         <w:rPr>
           <w:lang w:eastAsia="ru-RU" w:bidi="ar-SA"/>
         </w:rPr>
@@ -3420,12 +3284,11 @@
     </w:p>
     <w:p>
       <w:pPr>
-        <w:pStyle w:val="af8"/>
+        <w:pStyle w:val="a1"/>
         <w:numPr>
           <w:ilvl w:val="0"/>
-          <w:numId w:val="11"/>
+          <w:numId w:val="19"/>
         </w:numPr>
-        <w:spacing w:line="360" w:lineRule="auto"/>
         <w:rPr>
           <w:lang w:eastAsia="ru-RU" w:bidi="ar-SA"/>
         </w:rPr>
@@ -3439,12 +3302,11 @@
     </w:p>
     <w:p>
       <w:pPr>
-        <w:pStyle w:val="af8"/>
+        <w:pStyle w:val="a1"/>
         <w:numPr>
           <w:ilvl w:val="0"/>
-          <w:numId w:val="11"/>
+          <w:numId w:val="19"/>
         </w:numPr>
-        <w:spacing w:line="360" w:lineRule="auto"/>
         <w:rPr>
           <w:lang w:eastAsia="ru-RU" w:bidi="ar-SA"/>
         </w:rPr>
@@ -3464,12 +3326,11 @@
     </w:p>
     <w:p>
       <w:pPr>
-        <w:pStyle w:val="af8"/>
+        <w:pStyle w:val="a1"/>
         <w:numPr>
           <w:ilvl w:val="0"/>
-          <w:numId w:val="11"/>
+          <w:numId w:val="19"/>
         </w:numPr>
-        <w:spacing w:line="360" w:lineRule="auto"/>
         <w:rPr>
           <w:lang w:eastAsia="ru-RU" w:bidi="ar-SA"/>
         </w:rPr>
@@ -3489,12 +3350,11 @@
     </w:p>
     <w:p>
       <w:pPr>
-        <w:pStyle w:val="af8"/>
+        <w:pStyle w:val="a1"/>
         <w:numPr>
           <w:ilvl w:val="0"/>
-          <w:numId w:val="11"/>
+          <w:numId w:val="19"/>
         </w:numPr>
-        <w:spacing w:line="360" w:lineRule="auto"/>
         <w:rPr>
           <w:lang w:eastAsia="ru-RU" w:bidi="ar-SA"/>
         </w:rPr>
@@ -3508,12 +3368,11 @@
     </w:p>
     <w:p>
       <w:pPr>
-        <w:pStyle w:val="af8"/>
+        <w:pStyle w:val="a1"/>
         <w:numPr>
           <w:ilvl w:val="0"/>
-          <w:numId w:val="11"/>
+          <w:numId w:val="19"/>
         </w:numPr>
-        <w:spacing w:line="360" w:lineRule="auto"/>
         <w:rPr>
           <w:lang w:eastAsia="ru-RU" w:bidi="ar-SA"/>
         </w:rPr>
@@ -3538,19 +3397,14 @@
           <w:numId w:val="2"/>
         </w:numPr>
       </w:pPr>
-      <w:bookmarkStart w:id="8" w:name="_Toc234402005"/>
+      <w:bookmarkStart w:id="8" w:name="_Toc234882185"/>
       <w:r>
         <w:t xml:space="preserve">2.2. </w:t>
       </w:r>
       <w:r>
-        <w:t xml:space="preserve">Изучение особенностей задачи решения </w:t>
-      </w:r>
-      <w:proofErr w:type="spellStart"/>
-      <w:r>
-        <w:t>судоку</w:t>
+        <w:t>Изучение особенностей задачи решения судоку</w:t>
       </w:r>
       <w:bookmarkEnd w:id="8"/>
-      <w:proofErr w:type="spellEnd"/>
     </w:p>
     <w:p>
       <w:pPr>
@@ -3596,24 +3450,15 @@
       </w:pPr>
       <w:r>
         <w:tab/>
-        <w:t xml:space="preserve">Для оценки решений была выбрана функция качества, основанная на количестве нарушений правил </w:t>
-      </w:r>
-      <w:proofErr w:type="spellStart"/>
-      <w:r>
-        <w:t>судоку</w:t>
-      </w:r>
-      <w:proofErr w:type="spellEnd"/>
-      <w:r>
-        <w:t xml:space="preserve">. За одно нарушение считается повторяющаяся цифра в строке, столбце или блоке, при этом нарушение в одной клетке считается максимум один раз. Если нарушений нет, решение </w:t>
+        <w:t xml:space="preserve">Для оценки решений была выбрана функция качества, основанная на количестве нарушений правил судоку. За одно нарушение считается повторяющаяся цифра в строке, столбце или блоке, при этом нарушение в </w:t>
       </w:r>
       <w:r>
         <w:lastRenderedPageBreak/>
-        <w:t>считается корректным. Формула функции качества</w:t>
+        <w:t>одной клетке считается максимум один раз. Если нарушений нет, решение считается корректным. Формула функции качества</w:t>
       </w:r>
       <w:r>
         <w:t xml:space="preserve">: </w:t>
       </w:r>
-      <w:proofErr w:type="gramStart"/>
       <w:r>
         <w:rPr>
           <w:lang w:val="en-US"/>
@@ -3621,11 +3466,7 @@
         <w:t>exp</w:t>
       </w:r>
       <w:r>
-        <w:t>(</w:t>
-      </w:r>
-      <w:proofErr w:type="gramEnd"/>
-      <w:r>
-        <w:t xml:space="preserve">-0.1 * </w:t>
+        <w:t xml:space="preserve">(-0.1 * </w:t>
       </w:r>
       <w:r>
         <w:t>количество нарушений</w:t>
@@ -3651,7 +3492,7 @@
           <w:numId w:val="2"/>
         </w:numPr>
       </w:pPr>
-      <w:bookmarkStart w:id="9" w:name="_Toc234402006"/>
+      <w:bookmarkStart w:id="9" w:name="_Toc234882186"/>
       <w:r>
         <w:t xml:space="preserve">2.3. </w:t>
       </w:r>
@@ -3697,13 +3538,8 @@
         </w:numPr>
       </w:pPr>
       <w:r>
-        <w:t xml:space="preserve">Модуль работы с полем </w:t>
-      </w:r>
-      <w:proofErr w:type="spellStart"/>
-      <w:r>
-        <w:t>судоку</w:t>
-      </w:r>
-      <w:proofErr w:type="spellEnd"/>
+        <w:t>Модуль работы с полем судоку</w:t>
+      </w:r>
     </w:p>
     <w:p>
       <w:pPr>
@@ -3752,13 +3588,8 @@
         </w:numPr>
       </w:pPr>
       <w:r>
-        <w:t xml:space="preserve">Разработка модели игрового поля </w:t>
-      </w:r>
-      <w:proofErr w:type="spellStart"/>
-      <w:r>
-        <w:t>судоку</w:t>
-      </w:r>
-      <w:proofErr w:type="spellEnd"/>
+        <w:t>Разработка модели игрового поля судоку</w:t>
+      </w:r>
     </w:p>
     <w:p>
       <w:pPr>
@@ -3769,13 +3600,8 @@
         </w:numPr>
       </w:pPr>
       <w:r>
-        <w:t xml:space="preserve">Реализация правил валидации и подсчета ошибок для </w:t>
-      </w:r>
-      <w:proofErr w:type="spellStart"/>
-      <w:r>
-        <w:t>судоку</w:t>
-      </w:r>
-      <w:proofErr w:type="spellEnd"/>
+        <w:t>Реализация правил валидации и подсчета ошибок для судоку</w:t>
+      </w:r>
     </w:p>
     <w:p>
       <w:pPr>
@@ -3810,13 +3636,8 @@
         </w:numPr>
       </w:pPr>
       <w:r>
-        <w:t xml:space="preserve">Реализация функции качества для задачи </w:t>
-      </w:r>
-      <w:proofErr w:type="spellStart"/>
-      <w:r>
-        <w:t>судоку</w:t>
-      </w:r>
-      <w:proofErr w:type="spellEnd"/>
+        <w:t>Реализация функции качества для задачи судоку</w:t>
+      </w:r>
     </w:p>
     <w:p>
       <w:pPr>
@@ -3889,7 +3710,7 @@
         <w:pStyle w:val="3"/>
         <w:ind w:left="0"/>
       </w:pPr>
-      <w:bookmarkStart w:id="10" w:name="_Toc234402007"/>
+      <w:bookmarkStart w:id="10" w:name="_Toc234882187"/>
       <w:r>
         <w:t xml:space="preserve">2.4. </w:t>
       </w:r>
@@ -3900,29 +3721,25 @@
     </w:p>
     <w:p>
       <w:pPr>
-        <w:pStyle w:val="a"/>
-        <w:numPr>
-          <w:ilvl w:val="0"/>
-          <w:numId w:val="0"/>
-        </w:numPr>
-      </w:pPr>
-      <w:r>
-        <w:tab/>
+        <w:pStyle w:val="a1"/>
+      </w:pPr>
+      <w:r>
         <w:t>На данном этапе были определены основные инструменты, которые будут использоваться для реализации поставленной задачи.</w:t>
       </w:r>
     </w:p>
     <w:p>
       <w:pPr>
-        <w:pStyle w:val="a"/>
-        <w:numPr>
-          <w:ilvl w:val="0"/>
-          <w:numId w:val="0"/>
-        </w:numPr>
+        <w:pStyle w:val="a1"/>
       </w:pPr>
       <w:r>
         <w:lastRenderedPageBreak/>
-        <w:tab/>
-        <w:t xml:space="preserve">В качестве основного языка программирования был выбран </w:t>
+        <w:t>Для создания приложения</w:t>
+      </w:r>
+      <w:r>
+        <w:t xml:space="preserve"> был выбран </w:t>
+      </w:r>
+      <w:r>
+        <w:t xml:space="preserve">язык программирования </w:t>
       </w:r>
       <w:r>
         <w:rPr>
@@ -3940,15 +3757,7 @@
         <w:t>ъ</w:t>
       </w:r>
       <w:r>
-        <w:t xml:space="preserve">ектно-ориентированное программирование и позволяет разделить программу на классы и модули, а </w:t>
-      </w:r>
-      <w:proofErr w:type="gramStart"/>
-      <w:r>
-        <w:t>так же</w:t>
-      </w:r>
-      <w:proofErr w:type="gramEnd"/>
-      <w:r>
-        <w:t xml:space="preserve"> имеет средства для реализ</w:t>
+        <w:t>ектно-ориентированное программирование и позволяет разделить программу на классы и модули, а также имеет средства для реализ</w:t>
       </w:r>
       <w:r>
         <w:t>а</w:t>
@@ -3959,14 +3768,9 @@
     </w:p>
     <w:p>
       <w:pPr>
-        <w:pStyle w:val="a"/>
-        <w:numPr>
-          <w:ilvl w:val="0"/>
-          <w:numId w:val="0"/>
-        </w:numPr>
-      </w:pPr>
-      <w:r>
-        <w:tab/>
+        <w:pStyle w:val="a1"/>
+      </w:pPr>
+      <w:r>
         <w:t xml:space="preserve">Для разработки графического интерфейса была выбрана библиотека </w:t>
       </w:r>
       <w:r>
@@ -3979,21 +3783,25 @@
         <w:t>,</w:t>
       </w:r>
       <w:r>
-        <w:t xml:space="preserve"> предоставляющая набор компонентов для создания </w:t>
-      </w:r>
-      <w:proofErr w:type="gramStart"/>
-      <w:r>
-        <w:t>оконных приложений</w:t>
-      </w:r>
-      <w:proofErr w:type="gramEnd"/>
-      <w:r>
-        <w:t xml:space="preserve"> включающих различные элементы интерфейса. Для редактирования графического интерфейса </w:t>
-      </w:r>
-      <w:r>
-        <w:rPr>
-          <w:lang w:val="en-US"/>
-        </w:rPr>
-        <w:t>JavaFX</w:t>
+        <w:t xml:space="preserve"> предоставляющая набор компонентов для </w:t>
+      </w:r>
+      <w:r>
+        <w:t>разработки</w:t>
+      </w:r>
+      <w:r>
+        <w:t xml:space="preserve"> оконных приложений. Для </w:t>
+      </w:r>
+      <w:r>
+        <w:t xml:space="preserve">проектирования и </w:t>
+      </w:r>
+      <w:r>
+        <w:t xml:space="preserve">редактирования </w:t>
+      </w:r>
+      <w:r>
+        <w:t xml:space="preserve">структуры </w:t>
+      </w:r>
+      <w:r>
+        <w:t>графического интерфейса</w:t>
       </w:r>
       <w:r>
         <w:t xml:space="preserve"> </w:t>
@@ -4001,40 +3809,38 @@
       <w:r>
         <w:t xml:space="preserve">применялась программа </w:t>
       </w:r>
-      <w:proofErr w:type="spellStart"/>
-      <w:r>
-        <w:rPr>
-          <w:lang w:val="en-US"/>
-        </w:rPr>
-        <w:t>SceneBuilder</w:t>
-      </w:r>
-      <w:proofErr w:type="spellEnd"/>
+      <w:r>
+        <w:rPr>
+          <w:lang w:val="en-US"/>
+        </w:rPr>
+        <w:t>Scene</w:t>
+      </w:r>
+      <w:r>
+        <w:t xml:space="preserve"> </w:t>
+      </w:r>
+      <w:r>
+        <w:rPr>
+          <w:lang w:val="en-US"/>
+        </w:rPr>
+        <w:t>Builder</w:t>
+      </w:r>
       <w:r>
         <w:t>.</w:t>
       </w:r>
     </w:p>
     <w:p>
       <w:pPr>
-        <w:pStyle w:val="a"/>
-        <w:numPr>
-          <w:ilvl w:val="0"/>
-          <w:numId w:val="0"/>
-        </w:numPr>
-      </w:pPr>
-      <w:r>
-        <w:tab/>
-      </w:r>
+        <w:pStyle w:val="a1"/>
+      </w:pPr>
       <w:r>
         <w:t xml:space="preserve">В качестве среды разработки использовалась </w:t>
       </w:r>
-      <w:proofErr w:type="spellStart"/>
       <w:r>
         <w:rPr>
           <w:lang w:val="en-US"/>
         </w:rPr>
         <w:t>Intellij</w:t>
       </w:r>
-      <w:proofErr w:type="spellEnd"/>
       <w:r>
         <w:t xml:space="preserve"> </w:t>
       </w:r>
@@ -4048,7 +3854,7 @@
         <w:t>.</w:t>
       </w:r>
       <w:r>
-        <w:t xml:space="preserve"> Данная среда предоставляет удобные инструменты для написания, сборки</w:t>
+        <w:t xml:space="preserve"> Данная среда предоставляет инструменты для написания, сборки</w:t>
       </w:r>
       <w:r>
         <w:t xml:space="preserve">, </w:t>
@@ -4072,20 +3878,13 @@
         <w:t xml:space="preserve"> </w:t>
       </w:r>
       <w:r>
-        <w:t xml:space="preserve">кода. </w:t>
-      </w:r>
-    </w:p>
-    <w:p>
-      <w:pPr>
-        <w:pStyle w:val="a"/>
-        <w:numPr>
-          <w:ilvl w:val="0"/>
-          <w:numId w:val="0"/>
-        </w:numPr>
-      </w:pPr>
-      <w:r>
-        <w:tab/>
-        <w:t xml:space="preserve">Для сборки проекта был выбран </w:t>
+        <w:t>кода. Для сборки проекта</w:t>
+      </w:r>
+      <w:r>
+        <w:t xml:space="preserve"> и управления зависимостями</w:t>
+      </w:r>
+      <w:r>
+        <w:t xml:space="preserve"> был выбран </w:t>
       </w:r>
       <w:r>
         <w:rPr>
@@ -4094,139 +3893,117 @@
         <w:t>Maven</w:t>
       </w:r>
       <w:r>
+        <w:t>.</w:t>
+      </w:r>
+    </w:p>
+    <w:p>
+      <w:pPr>
+        <w:pStyle w:val="a1"/>
+      </w:pPr>
+      <w:r>
+        <w:t>Для сокращения количества шаблонного кода применялась библ</w:t>
+      </w:r>
+      <w:r>
+        <w:t>и</w:t>
+      </w:r>
+      <w:r>
+        <w:t xml:space="preserve">отека </w:t>
+      </w:r>
+      <w:r>
+        <w:rPr>
+          <w:lang w:val="en-US"/>
+        </w:rPr>
+        <w:t>Lombok</w:t>
+      </w:r>
+      <w:r>
+        <w:t xml:space="preserve">, </w:t>
+      </w:r>
+      <w:r>
+        <w:t xml:space="preserve">предоставляющая набор аннотаций для автоматической генерации стандартных методов класса, таких как </w:t>
+      </w:r>
+      <w:r>
+        <w:rPr>
+          <w:lang w:val="en-US"/>
+        </w:rPr>
+        <w:t>Getter</w:t>
+      </w:r>
+      <w:r>
+        <w:t xml:space="preserve">, </w:t>
+      </w:r>
+      <w:r>
+        <w:rPr>
+          <w:lang w:val="en-US"/>
+        </w:rPr>
+        <w:t>Setter</w:t>
+      </w:r>
+      <w:r>
+        <w:t xml:space="preserve">, </w:t>
+      </w:r>
+      <w:r>
+        <w:rPr>
+          <w:lang w:val="en-US"/>
+        </w:rPr>
+        <w:t>Builder</w:t>
+      </w:r>
+      <w:r>
+        <w:t xml:space="preserve">, </w:t>
+      </w:r>
+      <w:r>
+        <w:rPr>
+          <w:lang w:val="en-US"/>
+        </w:rPr>
+        <w:t>Constructor</w:t>
+      </w:r>
+      <w:r>
+        <w:t xml:space="preserve"> </w:t>
+      </w:r>
+      <w:r>
+        <w:t>и других служебных элементов.</w:t>
+      </w:r>
+    </w:p>
+    <w:p>
+      <w:pPr>
+        <w:pStyle w:val="a1"/>
+      </w:pPr>
+      <w:r>
+        <w:t xml:space="preserve">Для хранения данных использовалась библиотека </w:t>
+      </w:r>
+      <w:r>
+        <w:rPr>
+          <w:lang w:val="en-US"/>
+        </w:rPr>
+        <w:t>Jackson</w:t>
+      </w:r>
+      <w:r>
+        <w:t xml:space="preserve"> </w:t>
+      </w:r>
+      <w:r>
+        <w:rPr>
+          <w:lang w:val="en-US"/>
+        </w:rPr>
+        <w:t>Databind</w:t>
+      </w:r>
+      <w:r>
+        <w:t xml:space="preserve">, </w:t>
+      </w:r>
+      <w:r>
+        <w:t xml:space="preserve">позволяющая записывать и читать объекты в формате </w:t>
+      </w:r>
+      <w:r>
+        <w:rPr>
+          <w:lang w:val="en-US"/>
+        </w:rPr>
+        <w:t>JSON</w:t>
+      </w:r>
+      <w:r>
         <w:t xml:space="preserve">. </w:t>
       </w:r>
-      <w:r>
-        <w:t>Данная система сборки позволяет подключать необходимые библиотеки и настраивать процесс сборки приложения.</w:t>
-      </w:r>
-    </w:p>
-    <w:p>
-      <w:pPr>
-        <w:pStyle w:val="a"/>
-        <w:numPr>
-          <w:ilvl w:val="0"/>
-          <w:numId w:val="0"/>
-        </w:numPr>
-      </w:pPr>
-      <w:r>
-        <w:tab/>
-        <w:t xml:space="preserve">Для сокращения количества шаблонного кода применялась </w:t>
-      </w:r>
-      <w:proofErr w:type="spellStart"/>
-      <w:r>
-        <w:t>библеотека</w:t>
-      </w:r>
-      <w:proofErr w:type="spellEnd"/>
-      <w:r>
-        <w:t xml:space="preserve"> </w:t>
-      </w:r>
-      <w:r>
-        <w:rPr>
-          <w:lang w:val="en-US"/>
-        </w:rPr>
-        <w:t>Lombok</w:t>
-      </w:r>
-      <w:r>
-        <w:t xml:space="preserve">, </w:t>
-      </w:r>
-      <w:r>
-        <w:t xml:space="preserve">предоставляющая набор аннотаций для автоматической генерации стандартных методов класса, таких как </w:t>
-      </w:r>
-      <w:r>
-        <w:rPr>
-          <w:lang w:val="en-US"/>
-        </w:rPr>
-        <w:t>Getter</w:t>
-      </w:r>
-      <w:r>
-        <w:t xml:space="preserve">, </w:t>
-      </w:r>
-      <w:r>
-        <w:rPr>
-          <w:lang w:val="en-US"/>
-        </w:rPr>
-        <w:t>Setter</w:t>
-      </w:r>
-      <w:r>
-        <w:t xml:space="preserve">, </w:t>
-      </w:r>
-      <w:r>
-        <w:rPr>
-          <w:lang w:val="en-US"/>
-        </w:rPr>
-        <w:t>Builder</w:t>
-      </w:r>
-      <w:r>
-        <w:t xml:space="preserve">, </w:t>
-      </w:r>
-      <w:r>
-        <w:rPr>
-          <w:lang w:val="en-US"/>
-        </w:rPr>
-        <w:t>Constructor</w:t>
-      </w:r>
-      <w:r>
-        <w:t xml:space="preserve"> </w:t>
-      </w:r>
-      <w:r>
-        <w:t>и других служебных элементов.</w:t>
-      </w:r>
-    </w:p>
-    <w:p>
-      <w:pPr>
-        <w:pStyle w:val="a"/>
-        <w:numPr>
-          <w:ilvl w:val="0"/>
-          <w:numId w:val="0"/>
-        </w:numPr>
-      </w:pPr>
-      <w:r>
-        <w:tab/>
-        <w:t xml:space="preserve">Для хранения данных использовалась библиотека </w:t>
-      </w:r>
-      <w:r>
-        <w:rPr>
-          <w:lang w:val="en-US"/>
-        </w:rPr>
-        <w:t>Jackson</w:t>
-      </w:r>
-      <w:r>
-        <w:t xml:space="preserve"> </w:t>
-      </w:r>
-      <w:proofErr w:type="spellStart"/>
-      <w:r>
-        <w:rPr>
-          <w:lang w:val="en-US"/>
-        </w:rPr>
-        <w:t>Databind</w:t>
-      </w:r>
-      <w:proofErr w:type="spellEnd"/>
-      <w:r>
-        <w:t xml:space="preserve">, </w:t>
-      </w:r>
-      <w:r>
-        <w:t xml:space="preserve">позволяющая записывать и читать объекты в формате </w:t>
-      </w:r>
-      <w:r>
-        <w:rPr>
-          <w:lang w:val="en-US"/>
-        </w:rPr>
-        <w:t>JSON</w:t>
-      </w:r>
-      <w:r>
-        <w:t xml:space="preserve">. </w:t>
-      </w:r>
-    </w:p>
-    <w:p>
-      <w:pPr>
-        <w:pStyle w:val="a"/>
-        <w:numPr>
-          <w:ilvl w:val="0"/>
-          <w:numId w:val="0"/>
-        </w:numPr>
-      </w:pPr>
-      <w:r>
-        <w:tab/>
+    </w:p>
+    <w:p>
+      <w:pPr>
+        <w:pStyle w:val="a1"/>
+      </w:pPr>
+      <w:r>
         <w:t xml:space="preserve">Для хранения и контроля версий проекта использовалась система </w:t>
       </w:r>
       <w:r>
@@ -4259,7 +4036,7 @@
         <w:pStyle w:val="3"/>
         <w:ind w:left="0"/>
       </w:pPr>
-      <w:bookmarkStart w:id="11" w:name="_Toc234402008"/>
+      <w:bookmarkStart w:id="11" w:name="_Toc234882188"/>
       <w:r>
         <w:t>2.5. Разработка прототипа графического интерфейса программы</w:t>
       </w:r>
@@ -4270,15 +4047,7 @@
         <w:pStyle w:val="a1"/>
       </w:pPr>
       <w:r>
-        <w:t xml:space="preserve">На данном этапе был разработан прототип графического интерфейса программы. </w:t>
-      </w:r>
-    </w:p>
-    <w:p>
-      <w:pPr>
-        <w:pStyle w:val="a1"/>
-      </w:pPr>
-      <w:r>
-        <w:t>Были определены основные элементы, которые дол</w:t>
+        <w:t>На данном этапе был разработан прототип графического интерфейса программы. Были определены основные элементы, которые дол</w:t>
       </w:r>
       <w:r>
         <w:t>ж</w:t>
@@ -4299,19 +4068,22 @@
         </w:numPr>
       </w:pPr>
       <w:r>
-        <w:lastRenderedPageBreak/>
-        <w:t xml:space="preserve">Отображение поля </w:t>
-      </w:r>
-      <w:proofErr w:type="spellStart"/>
-      <w:r>
-        <w:t>судоку</w:t>
-      </w:r>
-      <w:proofErr w:type="spellEnd"/>
-      <w:r>
-        <w:t xml:space="preserve">, </w:t>
+        <w:t>П</w:t>
+      </w:r>
+      <w:r>
+        <w:t>ол</w:t>
+      </w:r>
+      <w:r>
+        <w:t>е</w:t>
+      </w:r>
+      <w:r>
+        <w:t xml:space="preserve"> судоку, </w:t>
       </w:r>
       <w:r>
         <w:t>содержащее информацию о фиксированных значениях в клетках, и значениях, установленных выбранной хромосомой генетического алгоритма</w:t>
+      </w:r>
+      <w:r>
+        <w:t>.</w:t>
       </w:r>
     </w:p>
     <w:p>
@@ -4323,7 +4095,11 @@
         </w:numPr>
       </w:pPr>
       <w:r>
+        <w:lastRenderedPageBreak/>
         <w:t>Отображение графика изменения функции качества от номера популяции</w:t>
+      </w:r>
+      <w:r>
+        <w:t>.</w:t>
       </w:r>
     </w:p>
     <w:p>
@@ -4335,15 +4111,10 @@
         </w:numPr>
       </w:pPr>
       <w:r>
-        <w:t xml:space="preserve">Область для настройки параметров поля </w:t>
-      </w:r>
-      <w:proofErr w:type="spellStart"/>
-      <w:r>
-        <w:t>судоку</w:t>
-      </w:r>
-      <w:proofErr w:type="spellEnd"/>
-      <w:r>
-        <w:t>, генетического алгоритма и визуализации</w:t>
+        <w:t>Область для настройки параметров поля судоку, генетического алгоритма и визуализации</w:t>
+      </w:r>
+      <w:r>
+        <w:t>.</w:t>
       </w:r>
     </w:p>
     <w:p>
@@ -4354,13 +4125,17 @@
           <w:numId w:val="14"/>
         </w:numPr>
       </w:pPr>
-      <w:proofErr w:type="gramStart"/>
       <w:r>
         <w:t>Область</w:t>
       </w:r>
-      <w:proofErr w:type="gramEnd"/>
+      <w:r>
+        <w:t>,</w:t>
+      </w:r>
       <w:r>
         <w:t xml:space="preserve"> содержащая информацию о текущем состоянии генетического алгоритма</w:t>
+      </w:r>
+      <w:r>
+        <w:t>.</w:t>
       </w:r>
     </w:p>
     <w:p>
@@ -4372,13 +4147,11 @@
         </w:numPr>
       </w:pPr>
       <w:r>
-        <w:t xml:space="preserve">Отдельное окно для ручного ввода поля </w:t>
-      </w:r>
-      <w:proofErr w:type="spellStart"/>
-      <w:r>
-        <w:t>судоку</w:t>
-      </w:r>
-      <w:proofErr w:type="spellEnd"/>
+        <w:t>Отдельное окно для ручного ввода поля судоку</w:t>
+      </w:r>
+      <w:r>
+        <w:t>.</w:t>
+      </w:r>
     </w:p>
     <w:p>
       <w:pPr>
@@ -4388,6 +4161,9 @@
       <w:r>
         <w:tab/>
         <w:t>В результате был создан прототип графического интерфейса</w:t>
+      </w:r>
+      <w:r>
+        <w:t>, представленный на рис. 1 и рис. 2</w:t>
       </w:r>
       <w:r>
         <w:t>:</w:t>
@@ -4450,6 +4226,9 @@
       </w:pPr>
       <w:r>
         <w:t>Рисунок 1 – Прототип графического интерфейса</w:t>
+      </w:r>
+      <w:r>
+        <w:t>. Основное окно.</w:t>
       </w:r>
     </w:p>
     <w:p>
@@ -4503,24 +4282,7 @@
         <w:pStyle w:val="af3"/>
       </w:pPr>
       <w:r>
-        <w:t xml:space="preserve">Рисунок </w:t>
-      </w:r>
-      <w:r>
-        <w:t>2</w:t>
-      </w:r>
-      <w:r>
-        <w:t xml:space="preserve"> – Прототип графического интерфейса</w:t>
-      </w:r>
-      <w:r>
-        <w:t xml:space="preserve">. Окно ручного ввода </w:t>
-      </w:r>
-      <w:proofErr w:type="spellStart"/>
-      <w:r>
-        <w:t>судоку</w:t>
-      </w:r>
-      <w:proofErr w:type="spellEnd"/>
-      <w:r>
-        <w:t>.</w:t>
+        <w:t>Рисунок 2 – Прототип графического интерфейса. Окно ручного ввода судоку.</w:t>
       </w:r>
     </w:p>
     <w:p>
@@ -4533,7 +4295,7 @@
         <w:pStyle w:val="3"/>
         <w:ind w:left="0"/>
       </w:pPr>
-      <w:bookmarkStart w:id="12" w:name="_Toc234402009"/>
+      <w:bookmarkStart w:id="12" w:name="_Toc234882189"/>
       <w:r>
         <w:t>2.6. Реализация генетического алгоритма</w:t>
       </w:r>
@@ -4542,144 +4304,1263 @@
     <w:p>
       <w:pPr>
         <w:pStyle w:val="a1"/>
-      </w:pPr>
-      <w:r>
-        <w:t xml:space="preserve">В качестве генотипа одного экземпляра был выбран набор целых чисел от 1 до 9, характеризующий решение </w:t>
-      </w:r>
-      <w:proofErr w:type="spellStart"/>
-      <w:r>
-        <w:t>судоку</w:t>
-      </w:r>
-      <w:proofErr w:type="spellEnd"/>
-      <w:r>
-        <w:t xml:space="preserve">. Каждое число сопоставляется значению клетки поля </w:t>
-      </w:r>
-      <w:proofErr w:type="spellStart"/>
-      <w:r>
-        <w:t>судоку</w:t>
-      </w:r>
-      <w:proofErr w:type="spellEnd"/>
+        <w:rPr>
+          <w:lang w:val="en-US"/>
+        </w:rPr>
+      </w:pPr>
+      <w:r>
+        <w:t xml:space="preserve">В основе реализованного генетического алгоритма лежит класс </w:t>
+      </w:r>
+      <w:r>
+        <w:rPr>
+          <w:lang w:val="en-US"/>
+        </w:rPr>
+        <w:t>GeneticAlgorithm</w:t>
+      </w:r>
+      <w:r>
+        <w:t>&lt;</w:t>
+      </w:r>
+      <w:r>
+        <w:rPr>
+          <w:lang w:val="en-US"/>
+        </w:rPr>
+        <w:t>DNA</w:t>
+      </w:r>
+      <w:r>
+        <w:t>&gt;</w:t>
+      </w:r>
+      <w:r>
+        <w:t>, не зависящий от конкретного способа представления решения. Основные компоненты вынесены в отдельные интерфейсы</w:t>
+      </w:r>
+      <w:r>
+        <w:t xml:space="preserve">: </w:t>
+      </w:r>
+    </w:p>
+    <w:p>
+      <w:pPr>
+        <w:pStyle w:val="a1"/>
+        <w:numPr>
+          <w:ilvl w:val="0"/>
+          <w:numId w:val="17"/>
+        </w:numPr>
+        <w:rPr>
+          <w:lang w:val="en-US"/>
+        </w:rPr>
+      </w:pPr>
+      <w:r>
+        <w:rPr>
+          <w:lang w:val="en-US"/>
+        </w:rPr>
+        <w:t xml:space="preserve">GAInitializer – </w:t>
+      </w:r>
+      <w:r>
+        <w:t>формирует начальную популяцию.</w:t>
+      </w:r>
+    </w:p>
+    <w:p>
+      <w:pPr>
+        <w:pStyle w:val="a1"/>
+        <w:numPr>
+          <w:ilvl w:val="0"/>
+          <w:numId w:val="17"/>
+        </w:numPr>
+      </w:pPr>
+      <w:r>
+        <w:rPr>
+          <w:lang w:val="en-US"/>
+        </w:rPr>
+        <w:t>GASelector</w:t>
+      </w:r>
+      <w:r>
+        <w:t xml:space="preserve"> – </w:t>
+      </w:r>
+      <w:r>
+        <w:t>осуществляет отбор особей для следующего поколения.</w:t>
+      </w:r>
+    </w:p>
+    <w:p>
+      <w:pPr>
+        <w:pStyle w:val="a1"/>
+        <w:numPr>
+          <w:ilvl w:val="0"/>
+          <w:numId w:val="17"/>
+        </w:numPr>
+      </w:pPr>
+      <w:r>
+        <w:rPr>
+          <w:lang w:val="en-US"/>
+        </w:rPr>
+        <w:t>GACrossover</w:t>
+      </w:r>
+      <w:r>
+        <w:t xml:space="preserve"> – </w:t>
+      </w:r>
+      <w:r>
+        <w:t>отвечает за скрещивание особей.</w:t>
+      </w:r>
+    </w:p>
+    <w:p>
+      <w:pPr>
+        <w:pStyle w:val="a1"/>
+        <w:numPr>
+          <w:ilvl w:val="0"/>
+          <w:numId w:val="17"/>
+        </w:numPr>
+      </w:pPr>
+      <w:r>
+        <w:rPr>
+          <w:lang w:val="en-US"/>
+        </w:rPr>
+        <w:t xml:space="preserve">GAMutate – </w:t>
+      </w:r>
+      <w:r>
+        <w:t>осуществляет мутацию особей.</w:t>
+      </w:r>
+    </w:p>
+    <w:p>
+      <w:pPr>
+        <w:pStyle w:val="a1"/>
+        <w:numPr>
+          <w:ilvl w:val="0"/>
+          <w:numId w:val="17"/>
+        </w:numPr>
+      </w:pPr>
+      <w:r>
+        <w:rPr>
+          <w:lang w:val="en-US"/>
+        </w:rPr>
+        <w:t>GATask</w:t>
+      </w:r>
+      <w:r>
+        <w:t xml:space="preserve"> – </w:t>
+      </w:r>
+      <w:r>
+        <w:t>содержит методы вычисления функции качества, проверки условия остановки и коррекции генотипа.</w:t>
+      </w:r>
+    </w:p>
+    <w:p>
+      <w:pPr>
+        <w:pStyle w:val="a1"/>
+        <w:ind w:firstLine="0"/>
+        <w:rPr>
+          <w:lang w:val="en-US"/>
+        </w:rPr>
+      </w:pPr>
+      <w:r>
+        <w:tab/>
+        <w:t xml:space="preserve">Параметры работы алгоритма хранятся в классе </w:t>
+      </w:r>
+      <w:r>
+        <w:rPr>
+          <w:lang w:val="en-US"/>
+        </w:rPr>
+        <w:t>GAConfig</w:t>
+      </w:r>
+      <w:r>
+        <w:t>. Перед запуском алгоритма осуществляется проверка конфигурации на корректность. Реализованы следующие конфигурационные параметры</w:t>
+      </w:r>
+      <w:r>
+        <w:rPr>
+          <w:lang w:val="en-US"/>
+        </w:rPr>
+        <w:t>:</w:t>
+      </w:r>
+    </w:p>
+    <w:p>
+      <w:pPr>
+        <w:pStyle w:val="a1"/>
+        <w:numPr>
+          <w:ilvl w:val="0"/>
+          <w:numId w:val="18"/>
+        </w:numPr>
+      </w:pPr>
+      <w:r>
+        <w:rPr>
+          <w:lang w:val="en-US"/>
+        </w:rPr>
+        <w:t>generations</w:t>
+      </w:r>
+      <w:r>
+        <w:t xml:space="preserve"> – </w:t>
+      </w:r>
+      <w:r>
+        <w:t>максимальное число поколений до остановки алгоритма.</w:t>
+      </w:r>
+    </w:p>
+    <w:p>
+      <w:pPr>
+        <w:pStyle w:val="a1"/>
+        <w:numPr>
+          <w:ilvl w:val="0"/>
+          <w:numId w:val="18"/>
+        </w:numPr>
+      </w:pPr>
+      <w:r>
+        <w:rPr>
+          <w:lang w:val="en-US"/>
+        </w:rPr>
+        <w:t>populationSize</w:t>
+      </w:r>
+      <w:r>
+        <w:t xml:space="preserve"> – </w:t>
+      </w:r>
+      <w:r>
+        <w:t>число особей в одном поколении.</w:t>
+      </w:r>
+    </w:p>
+    <w:p>
+      <w:pPr>
+        <w:pStyle w:val="a1"/>
+        <w:numPr>
+          <w:ilvl w:val="0"/>
+          <w:numId w:val="18"/>
+        </w:numPr>
+      </w:pPr>
+      <w:r>
+        <w:rPr>
+          <w:lang w:val="en-US"/>
+        </w:rPr>
+        <w:lastRenderedPageBreak/>
+        <w:t>copyBestRate</w:t>
+      </w:r>
+      <w:r>
+        <w:t xml:space="preserve"> – </w:t>
+      </w:r>
+      <w:r>
+        <w:t>доля</w:t>
+      </w:r>
+      <w:r>
+        <w:t xml:space="preserve"> </w:t>
+      </w:r>
+      <w:r>
+        <w:t>особей</w:t>
+      </w:r>
+      <w:r>
+        <w:t xml:space="preserve"> с наибольшим значением функции качества</w:t>
+      </w:r>
+      <w:r>
+        <w:t>, копируемых в следующее поколение.</w:t>
+      </w:r>
+    </w:p>
+    <w:p>
+      <w:pPr>
+        <w:pStyle w:val="a1"/>
+        <w:numPr>
+          <w:ilvl w:val="0"/>
+          <w:numId w:val="18"/>
+        </w:numPr>
+      </w:pPr>
+      <w:r>
+        <w:rPr>
+          <w:lang w:val="en-US"/>
+        </w:rPr>
+        <w:t xml:space="preserve">mutationRate – </w:t>
+      </w:r>
+      <w:r>
+        <w:t>вероятность мутации особи.</w:t>
+      </w:r>
+    </w:p>
+    <w:p>
+      <w:pPr>
+        <w:pStyle w:val="a1"/>
+        <w:numPr>
+          <w:ilvl w:val="0"/>
+          <w:numId w:val="18"/>
+        </w:numPr>
+      </w:pPr>
+      <w:r>
+        <w:rPr>
+          <w:lang w:val="en-US"/>
+        </w:rPr>
+        <w:t xml:space="preserve">crossoverRate – </w:t>
+      </w:r>
+      <w:r>
+        <w:t>вероятность скрещивания особей.</w:t>
+      </w:r>
+    </w:p>
+    <w:p>
+      <w:pPr>
+        <w:pStyle w:val="a1"/>
+        <w:numPr>
+          <w:ilvl w:val="0"/>
+          <w:numId w:val="18"/>
+        </w:numPr>
+      </w:pPr>
+      <w:r>
+        <w:rPr>
+          <w:lang w:val="en-US"/>
+        </w:rPr>
+        <w:t>stagnationGenerations</w:t>
+      </w:r>
+      <w:r>
+        <w:t xml:space="preserve"> – </w:t>
+      </w:r>
+      <w:r>
+        <w:t>число поколений при застое до повторной инициализации особей</w:t>
+      </w:r>
+    </w:p>
+    <w:p>
+      <w:pPr>
+        <w:pStyle w:val="a1"/>
+        <w:numPr>
+          <w:ilvl w:val="0"/>
+          <w:numId w:val="18"/>
+        </w:numPr>
+      </w:pPr>
+      <w:r>
+        <w:rPr>
+          <w:lang w:val="en-US"/>
+        </w:rPr>
+        <w:t>stagnationKeepRate</w:t>
+      </w:r>
+      <w:r>
+        <w:t xml:space="preserve"> – </w:t>
+      </w:r>
+      <w:r>
+        <w:t>доля особей</w:t>
+      </w:r>
+      <w:r>
+        <w:t xml:space="preserve"> </w:t>
+      </w:r>
+      <w:r>
+        <w:t>с наибольшим значением функции качества</w:t>
+      </w:r>
+      <w:r>
+        <w:t>, сохраняемых при стагнации.</w:t>
+      </w:r>
+    </w:p>
+    <w:p>
+      <w:pPr>
+        <w:pStyle w:val="a1"/>
+        <w:numPr>
+          <w:ilvl w:val="0"/>
+          <w:numId w:val="18"/>
+        </w:numPr>
+      </w:pPr>
+      <w:r>
+        <w:rPr>
+          <w:lang w:val="en-US"/>
+        </w:rPr>
+        <w:t>similarityPunishment</w:t>
+      </w:r>
+      <w:r>
+        <w:t xml:space="preserve"> – </w:t>
+      </w:r>
+      <w:r>
+        <w:t>коэффициент штрафа за сходство.</w:t>
+      </w:r>
+    </w:p>
+    <w:p>
+      <w:pPr>
+        <w:pStyle w:val="a1"/>
+        <w:numPr>
+          <w:ilvl w:val="0"/>
+          <w:numId w:val="18"/>
+        </w:numPr>
+      </w:pPr>
+      <w:r>
+        <w:rPr>
+          <w:lang w:val="en-US"/>
+        </w:rPr>
+        <w:t>similarityCompare</w:t>
+      </w:r>
+      <w:r>
+        <w:t xml:space="preserve"> – </w:t>
+      </w:r>
+      <w:r>
+        <w:t>число особей</w:t>
+      </w:r>
+      <w:r>
+        <w:t xml:space="preserve"> </w:t>
+      </w:r>
+      <w:r>
+        <w:t>с наибольшим значением функции качества</w:t>
+      </w:r>
+      <w:r>
+        <w:t>,</w:t>
+      </w:r>
+      <w:r>
+        <w:t xml:space="preserve"> проверяемых на сходство.</w:t>
+      </w:r>
+    </w:p>
+    <w:p>
+      <w:pPr>
+        <w:pStyle w:val="a1"/>
+        <w:numPr>
+          <w:ilvl w:val="0"/>
+          <w:numId w:val="18"/>
+        </w:numPr>
+      </w:pPr>
+      <w:r>
+        <w:rPr>
+          <w:lang w:val="en-US"/>
+        </w:rPr>
+        <w:t>similaritySkip</w:t>
+      </w:r>
+      <w:r>
+        <w:t xml:space="preserve"> – </w:t>
+      </w:r>
+      <w:r>
+        <w:t>число особей</w:t>
+      </w:r>
+      <w:r>
+        <w:t xml:space="preserve"> </w:t>
+      </w:r>
+      <w:r>
+        <w:t>с наибольшим значением функции качества</w:t>
+      </w:r>
+      <w:r>
+        <w:t xml:space="preserve"> без штрафа.</w:t>
+      </w:r>
+    </w:p>
+    <w:p>
+      <w:pPr>
+        <w:pStyle w:val="a1"/>
+        <w:numPr>
+          <w:ilvl w:val="0"/>
+          <w:numId w:val="18"/>
+        </w:numPr>
+      </w:pPr>
+      <w:r>
+        <w:rPr>
+          <w:lang w:val="en-US"/>
+        </w:rPr>
+        <w:t>similarityThreshold</w:t>
+      </w:r>
+      <w:r>
+        <w:t xml:space="preserve"> – </w:t>
+      </w:r>
+      <w:r>
+        <w:t>минимальный коэффициент сходства</w:t>
+      </w:r>
+      <w:r>
+        <w:t>,</w:t>
+      </w:r>
+      <w:r>
+        <w:t xml:space="preserve"> при котором накладывается штраф.</w:t>
+      </w:r>
+    </w:p>
+    <w:p>
+      <w:pPr>
+        <w:pStyle w:val="a1"/>
+        <w:numPr>
+          <w:ilvl w:val="0"/>
+          <w:numId w:val="18"/>
+        </w:numPr>
+      </w:pPr>
+      <w:r>
+        <w:rPr>
+          <w:lang w:val="en-US"/>
+        </w:rPr>
+        <w:t>delayBetweenGenerationsMs</w:t>
+      </w:r>
+      <w:r>
+        <w:t xml:space="preserve"> – </w:t>
+      </w:r>
+      <w:r>
+        <w:t>задержка между расчетом поколений в миллисекундах.</w:t>
+      </w:r>
+    </w:p>
+    <w:p>
+      <w:pPr>
+        <w:pStyle w:val="a1"/>
+        <w:numPr>
+          <w:ilvl w:val="0"/>
+          <w:numId w:val="18"/>
+        </w:numPr>
+      </w:pPr>
+      <w:r>
+        <w:rPr>
+          <w:lang w:val="en-US"/>
+        </w:rPr>
+        <w:t>randomSeed</w:t>
+      </w:r>
+      <w:r>
+        <w:t xml:space="preserve"> – </w:t>
+      </w:r>
+      <w:r>
+        <w:t>зерно генератора случайных чисел, используемое для осуществления детерминированных запусков.</w:t>
+      </w:r>
+    </w:p>
+    <w:p>
+      <w:pPr>
+        <w:pStyle w:val="a1"/>
+      </w:pPr>
+      <w:r>
+        <w:t>На каждой итерации выполняются оценка и сортировка популяции, сохранение особей</w:t>
+      </w:r>
+      <w:r>
+        <w:t xml:space="preserve"> </w:t>
+      </w:r>
+      <w:r>
+        <w:t>с наибольшим значением функции качества</w:t>
+      </w:r>
+      <w:r>
+        <w:t>, отбор родителей, скрещивание и мутация потомков. Оценка особей производится в многопоточном режиме, используя все доступные процессорные ядра.</w:t>
+      </w:r>
+    </w:p>
+    <w:p>
+      <w:pPr>
+        <w:pStyle w:val="a1"/>
+      </w:pPr>
+      <w:r>
+        <w:t>В качестве генотипа одно</w:t>
+      </w:r>
+      <w:r>
+        <w:t xml:space="preserve">й особи </w:t>
+      </w:r>
+      <w:r>
+        <w:t xml:space="preserve">был выбран </w:t>
+      </w:r>
+      <w:r>
+        <w:t>массив</w:t>
+      </w:r>
+      <w:r>
+        <w:t xml:space="preserve"> целых чисел от 1 до 9, характеризующий решение судоку. Каждое число сопоставляется значению клетки поля судоку. </w:t>
+      </w:r>
+      <w:r>
+        <w:t>Генотип был разделен на блоки</w:t>
+      </w:r>
+      <w:r>
+        <w:t>,</w:t>
+      </w:r>
+      <w:r>
+        <w:t xml:space="preserve"> </w:t>
+      </w:r>
+      <w:r>
+        <w:t>представляющие собой столбцы поля судоку</w:t>
+      </w:r>
+      <w:r>
+        <w:t>, каждый из которых не содержит повторяющихся элементов.</w:t>
+      </w:r>
+    </w:p>
+    <w:p>
+      <w:pPr>
+        <w:pStyle w:val="a1"/>
+      </w:pPr>
+      <w:r>
+        <w:lastRenderedPageBreak/>
+        <w:t>Инициализация начальной популяции выполнялась с учетом выбранного представления генотипа. Для каждого экземпляра популяции формировался список целых чисел, разбитый на блок</w:t>
+      </w:r>
+      <w:r>
+        <w:t>и</w:t>
+      </w:r>
+      <w:r>
+        <w:t xml:space="preserve"> по столбцам</w:t>
+      </w:r>
       <w:r>
         <w:t xml:space="preserve">. </w:t>
       </w:r>
       <w:r>
-        <w:t xml:space="preserve">Генотип был разделен </w:t>
-      </w:r>
-      <w:proofErr w:type="gramStart"/>
-      <w:r>
-        <w:t>на блоки</w:t>
-      </w:r>
-      <w:proofErr w:type="gramEnd"/>
+        <w:t>Далее к</w:t>
+      </w:r>
+      <w:r>
+        <w:t>аждый блок заполнялся числами от 1 до 9, после чего значения внутри блока случайным образом перемешивались</w:t>
+      </w:r>
+      <w:r>
+        <w:t>.</w:t>
+      </w:r>
+    </w:p>
+    <w:p>
+      <w:pPr>
+        <w:pStyle w:val="a1"/>
+      </w:pPr>
+      <w:r>
+        <w:t>Была реализована мутация обменом. При выполнении мутации случайным образом выбирается блок, а затем внутри него выбираются две позиции. Если выбранные позиции различаются, значения в них меняются местами. Количество выполняемых перестановок зависит от заданной пользователем частоты мутации. Чем выше значение параметра, тем больше мутаций может быть произведено над генотипом.</w:t>
+      </w:r>
+    </w:p>
+    <w:p>
+      <w:pPr>
+        <w:pStyle w:val="a1"/>
+      </w:pPr>
+      <w:r>
+        <w:t>Для отбора особей для следующего поколения был использован ранжированный метод отбора. Перед выполнением отбора особи упорядочиваются по</w:t>
+      </w:r>
+      <w:r>
+        <w:t xml:space="preserve"> заранее вычисленному</w:t>
+      </w:r>
+      <w:r>
+        <w:t xml:space="preserve"> значению функции качества. После этого каждой особи назначается вес в зависимости от ее позиции в полученном списке. Особи с более высоким рангом получают больший вес и имеют более высокую вероятность быть выбранными для дальнейшего скрещивания.</w:t>
+      </w:r>
+    </w:p>
+    <w:p>
+      <w:pPr>
+        <w:pStyle w:val="a1"/>
+      </w:pPr>
+      <w:r>
+        <w:t>Скрещивание было реализовано при помощи равномерного обмена блоками между двумя родительскими особями. Для первого потомка с равным шансом выбирался блок из первого или второго родителя, для второго выбирался блок ген</w:t>
+      </w:r>
+      <w:r>
+        <w:t>ов</w:t>
+      </w:r>
+      <w:r>
+        <w:t xml:space="preserve"> того родителя, </w:t>
+      </w:r>
+      <w:r>
+        <w:t>который не попал в первого потомка.</w:t>
+      </w:r>
+    </w:p>
+    <w:p>
+      <w:pPr>
+        <w:pStyle w:val="a1"/>
+      </w:pPr>
+      <w:r>
+        <w:t>Для того, чтобы алгоритм не сходился к единственному экстремуму, который может не являться верным решением, был реализован параллельный механизм образования ниш. На решения, находящиеся близко к друг другу накладывается штраф.</w:t>
+      </w:r>
       <w:r>
         <w:t xml:space="preserve"> </w:t>
       </w:r>
       <w:r>
-        <w:t xml:space="preserve">представляющие собой столбцы поля </w:t>
-      </w:r>
-      <w:proofErr w:type="spellStart"/>
-      <w:r>
-        <w:t>судоку</w:t>
-      </w:r>
-      <w:proofErr w:type="spellEnd"/>
-      <w:r>
-        <w:t>, каждый из которых не содержит повторяющихся элементов.</w:t>
-      </w:r>
-    </w:p>
-    <w:p>
-      <w:pPr>
-        <w:pStyle w:val="a1"/>
-      </w:pPr>
-      <w:r>
-        <w:t>Инициализация начальной популяции выполнялась с учетом выбранного представления генотипа. Для каждого экземпляра популяции формировался список целых чисел, разбитый на блок</w:t>
+        <w:t>Штраф вычисляется следующим образом</w:t>
+      </w:r>
+      <w:r>
+        <w:t>:</w:t>
+      </w:r>
+    </w:p>
+    <w:p>
+      <w:pPr>
+        <w:pStyle w:val="a1"/>
+        <w:numPr>
+          <w:ilvl w:val="0"/>
+          <w:numId w:val="16"/>
+        </w:numPr>
+      </w:pPr>
+      <w:r>
+        <w:t>Определенное количество особей с</w:t>
+      </w:r>
+      <w:r>
+        <w:t xml:space="preserve"> наибольшим значением функции качества</w:t>
+      </w:r>
+      <w:r>
+        <w:t xml:space="preserve"> не получают штраф, чтобы избежать возможного </w:t>
+      </w:r>
+      <w:r>
+        <w:t>исключения наиболее качественных</w:t>
+      </w:r>
+      <w:r>
+        <w:t xml:space="preserve"> решений.</w:t>
+      </w:r>
+    </w:p>
+    <w:p>
+      <w:pPr>
+        <w:pStyle w:val="a1"/>
+        <w:numPr>
+          <w:ilvl w:val="0"/>
+          <w:numId w:val="16"/>
+        </w:numPr>
+      </w:pPr>
+      <w:r>
+        <w:lastRenderedPageBreak/>
+        <w:t xml:space="preserve">Для всех остальных особей производится сравнение </w:t>
+      </w:r>
+      <w:r>
+        <w:t>с заданным количеством представителей поколения, имеющих наибольшие значения функции качества, за исключением самой оцениваемой особи.</w:t>
+      </w:r>
+    </w:p>
+    <w:p>
+      <w:pPr>
+        <w:pStyle w:val="a1"/>
+        <w:numPr>
+          <w:ilvl w:val="0"/>
+          <w:numId w:val="16"/>
+        </w:numPr>
+      </w:pPr>
+      <w:r>
+        <w:t>Вычисляется коэффициент сходства особей путем подсчета относительного количества совпадающих чисел.</w:t>
+      </w:r>
+    </w:p>
+    <w:p>
+      <w:pPr>
+        <w:pStyle w:val="a1"/>
+        <w:numPr>
+          <w:ilvl w:val="0"/>
+          <w:numId w:val="16"/>
+        </w:numPr>
+      </w:pPr>
+      <w:r>
+        <w:t xml:space="preserve">Из полученных значений берется максимальное, и накладывается штраф по формуле </w:t>
+      </w:r>
+      <w:r>
+        <w:rPr>
+          <w:lang w:val="en-US"/>
+        </w:rPr>
+        <w:t>score</w:t>
+      </w:r>
+      <w:r>
+        <w:t xml:space="preserve"> / (1 + </w:t>
+      </w:r>
+      <w:r>
+        <w:rPr>
+          <w:lang w:val="en-US"/>
+        </w:rPr>
+        <w:t>similarity</w:t>
+      </w:r>
+      <w:r>
+        <w:t xml:space="preserve"> * </w:t>
+      </w:r>
+      <w:r>
+        <w:rPr>
+          <w:lang w:val="en-US"/>
+        </w:rPr>
+        <w:t>punishment</w:t>
+      </w:r>
+      <w:r>
+        <w:t xml:space="preserve">), </w:t>
+      </w:r>
+      <w:r>
+        <w:t xml:space="preserve">где </w:t>
+      </w:r>
+      <w:r>
+        <w:rPr>
+          <w:lang w:val="en-US"/>
+        </w:rPr>
+        <w:t>score</w:t>
+      </w:r>
+      <w:r>
+        <w:t xml:space="preserve"> </w:t>
+      </w:r>
+      <w:r>
+        <w:t>–</w:t>
+      </w:r>
+      <w:r>
+        <w:t xml:space="preserve"> </w:t>
+      </w:r>
+      <w:r>
+        <w:t xml:space="preserve">исходный результат особи, </w:t>
+      </w:r>
+      <w:r>
+        <w:rPr>
+          <w:lang w:val="en-US"/>
+        </w:rPr>
+        <w:t>similarity</w:t>
+      </w:r>
+      <w:r>
+        <w:t xml:space="preserve"> </w:t>
+      </w:r>
+      <w:r>
+        <w:t>–</w:t>
+      </w:r>
+      <w:r>
+        <w:t xml:space="preserve"> </w:t>
+      </w:r>
+      <w:r>
+        <w:t xml:space="preserve">вычисленный коэффициент сходства, </w:t>
+      </w:r>
+      <w:r>
+        <w:rPr>
+          <w:lang w:val="en-US"/>
+        </w:rPr>
+        <w:t>punishment</w:t>
+      </w:r>
+      <w:r>
+        <w:t xml:space="preserve"> </w:t>
+      </w:r>
+      <w:r>
+        <w:t>–</w:t>
+      </w:r>
+      <w:r>
+        <w:t xml:space="preserve"> </w:t>
+      </w:r>
+      <w:r>
+        <w:t>заданный коэффициент штрафа.</w:t>
+      </w:r>
+    </w:p>
+    <w:p>
+      <w:pPr>
+        <w:pStyle w:val="a1"/>
+        <w:ind w:left="1418" w:firstLine="0"/>
+      </w:pPr>
+      <w:r>
+        <w:tab/>
+      </w:r>
+    </w:p>
+    <w:p>
+      <w:pPr>
+        <w:pStyle w:val="3"/>
+        <w:ind w:left="0"/>
+      </w:pPr>
+      <w:bookmarkStart w:id="13" w:name="_Toc234882190"/>
+      <w:r>
+        <w:t>2.7. Реализация графического интерфейса программы</w:t>
+      </w:r>
+      <w:bookmarkEnd w:id="13"/>
+    </w:p>
+    <w:p>
+      <w:pPr>
+        <w:pStyle w:val="a1"/>
+      </w:pPr>
+      <w:r>
+        <w:t xml:space="preserve">Для реализации графического интерфейса была выбрана библиотека </w:t>
+      </w:r>
+      <w:r>
+        <w:rPr>
+          <w:lang w:val="en-US"/>
+        </w:rPr>
+        <w:t>JavaFX</w:t>
+      </w:r>
+      <w:r>
+        <w:t xml:space="preserve">. Данная библиотека предоставляет набор компонентов для создания оконных приложений. Для редактирования графического интерфейса </w:t>
+      </w:r>
+      <w:r>
+        <w:t xml:space="preserve"> </w:t>
+      </w:r>
+      <w:r>
+        <w:t xml:space="preserve">применялась программа </w:t>
+      </w:r>
+      <w:r>
+        <w:rPr>
+          <w:lang w:val="en-US"/>
+        </w:rPr>
+        <w:t>Scene</w:t>
+      </w:r>
+      <w:r>
+        <w:t xml:space="preserve"> </w:t>
+      </w:r>
+      <w:r>
+        <w:rPr>
+          <w:lang w:val="en-US"/>
+        </w:rPr>
+        <w:t>Builder</w:t>
+      </w:r>
+      <w:r>
+        <w:t>.</w:t>
+      </w:r>
+      <w:r>
+        <w:t xml:space="preserve"> </w:t>
+      </w:r>
+    </w:p>
+    <w:p>
+      <w:pPr>
+        <w:pStyle w:val="a1"/>
+      </w:pPr>
+      <w:r>
+        <w:t xml:space="preserve">Расположение и стиль элементов графического интерфейса задаются при помощи </w:t>
+      </w:r>
+      <w:r>
+        <w:rPr>
+          <w:lang w:val="en-US"/>
+        </w:rPr>
+        <w:t>FXML</w:t>
+      </w:r>
+      <w:r>
+        <w:t>-</w:t>
+      </w:r>
+      <w:r>
+        <w:t xml:space="preserve">файлов, что позволило отделить описание внешнего вида приложения от программной логики. Для реализации кнопок и конфигурационных полей были использованы классы </w:t>
+      </w:r>
+      <w:r>
+        <w:rPr>
+          <w:lang w:val="en-US"/>
+        </w:rPr>
+        <w:t>JavaFX</w:t>
+      </w:r>
+      <w:r>
+        <w:t xml:space="preserve"> </w:t>
+      </w:r>
+      <w:r>
+        <w:rPr>
+          <w:lang w:val="en-US"/>
+        </w:rPr>
+        <w:t>Button</w:t>
+      </w:r>
+      <w:r>
+        <w:t xml:space="preserve"> </w:t>
+      </w:r>
+      <w:r>
+        <w:t xml:space="preserve">и </w:t>
+      </w:r>
+      <w:r>
+        <w:rPr>
+          <w:lang w:val="en-US"/>
+        </w:rPr>
+        <w:t>Spinner</w:t>
+      </w:r>
+      <w:r>
+        <w:t xml:space="preserve"> </w:t>
+      </w:r>
+      <w:r>
+        <w:t xml:space="preserve">соответственно. Отображение вкладок осуществляется при помощи элемента </w:t>
+      </w:r>
+      <w:r>
+        <w:rPr>
+          <w:lang w:val="en-US"/>
+        </w:rPr>
+        <w:t>TabPane</w:t>
+      </w:r>
+      <w:r>
+        <w:t xml:space="preserve">. </w:t>
+      </w:r>
+      <w:r>
+        <w:t xml:space="preserve">Для отрисовки графика зависимости используется </w:t>
+      </w:r>
+      <w:r>
+        <w:rPr>
+          <w:lang w:val="en-US"/>
+        </w:rPr>
+        <w:t>LineChart</w:t>
+      </w:r>
+      <w:r>
+        <w:t xml:space="preserve">. </w:t>
+      </w:r>
+      <w:r>
+        <w:t xml:space="preserve">Текстовое поле, отображающее информацию о текущей генерации реализовано при помощи </w:t>
+      </w:r>
+      <w:r>
+        <w:rPr>
+          <w:lang w:val="en-US"/>
+        </w:rPr>
+        <w:t>TextArea</w:t>
+      </w:r>
+      <w:r>
+        <w:t xml:space="preserve">. </w:t>
+      </w:r>
+      <w:r>
+        <w:t xml:space="preserve">Отображение поля судоку производится при помощи вызова методов класса </w:t>
+      </w:r>
+      <w:r>
+        <w:rPr>
+          <w:lang w:val="en-US"/>
+        </w:rPr>
+        <w:t>GraphicsContext</w:t>
+      </w:r>
+      <w:r>
+        <w:t>,</w:t>
+      </w:r>
+      <w:r>
+        <w:t xml:space="preserve"> связанного с </w:t>
+      </w:r>
+      <w:r>
+        <w:rPr>
+          <w:lang w:val="en-US"/>
+        </w:rPr>
+        <w:t>Canvas</w:t>
+      </w:r>
+      <w:r>
+        <w:t xml:space="preserve">. </w:t>
+      </w:r>
+      <w:r>
+        <w:t xml:space="preserve">Для контроля положения элементов окна используются </w:t>
+      </w:r>
+      <w:r>
+        <w:rPr>
+          <w:lang w:val="en-US"/>
+        </w:rPr>
+        <w:t>GridPane</w:t>
+      </w:r>
+      <w:r>
+        <w:t xml:space="preserve"> </w:t>
+      </w:r>
+      <w:r>
+        <w:t xml:space="preserve">и </w:t>
+      </w:r>
+      <w:r>
+        <w:rPr>
+          <w:lang w:val="en-US"/>
+        </w:rPr>
+        <w:t>VBox</w:t>
+      </w:r>
+      <w:r>
+        <w:t>.</w:t>
+      </w:r>
+      <w:r>
+        <w:t xml:space="preserve"> </w:t>
+      </w:r>
+    </w:p>
+    <w:p>
+      <w:pPr>
+        <w:pStyle w:val="a1"/>
+      </w:pPr>
+      <w:r>
+        <w:t xml:space="preserve">Для ввода поля судоку используется </w:t>
+      </w:r>
+      <w:r>
+        <w:rPr>
+          <w:lang w:val="en-US"/>
+        </w:rPr>
+        <w:t>GridPane</w:t>
+      </w:r>
+      <w:r>
+        <w:t xml:space="preserve">, </w:t>
+      </w:r>
+      <w:r>
+        <w:t xml:space="preserve">с элементами </w:t>
+      </w:r>
+      <w:r>
+        <w:rPr>
+          <w:lang w:val="en-US"/>
+        </w:rPr>
+        <w:t>TextField</w:t>
+      </w:r>
+      <w:r>
+        <w:t xml:space="preserve"> </w:t>
+      </w:r>
+      <w:r>
+        <w:t>для каждой клетки, динамически создаваемыми при открытии окна. Содержимое ячеек считывается, проверяется на корректность и записывается в матрицу судоку при нажатии на кнопку Готово.</w:t>
+      </w:r>
+    </w:p>
+    <w:p>
+      <w:pPr>
+        <w:pStyle w:val="a1"/>
+      </w:pPr>
+      <w:r>
+        <w:lastRenderedPageBreak/>
+        <w:t xml:space="preserve">Обработка ввода пользователя и динамическое изменение состояния интерфейса были реализованы в специальных классах-контроллерах </w:t>
+      </w:r>
+      <w:r>
+        <w:rPr>
+          <w:lang w:val="en-US"/>
+        </w:rPr>
+        <w:t>MainGuiController</w:t>
+      </w:r>
+      <w:r>
+        <w:t>.</w:t>
+      </w:r>
+      <w:r>
+        <w:rPr>
+          <w:lang w:val="en-US"/>
+        </w:rPr>
+        <w:t>java</w:t>
+      </w:r>
+      <w:r>
+        <w:t xml:space="preserve"> </w:t>
       </w:r>
       <w:r>
         <w:t>и</w:t>
       </w:r>
       <w:r>
-        <w:t xml:space="preserve"> по столбцам</w:t>
-      </w:r>
-      <w:r>
-        <w:t xml:space="preserve">. </w:t>
-      </w:r>
-      <w:r>
-        <w:t>Далее к</w:t>
-      </w:r>
-      <w:r>
-        <w:t>аждый блок заполнялся числами от 1 до 9, после чего значения внутри блока случайным образом перемешивались</w:t>
+        <w:t xml:space="preserve"> </w:t>
+      </w:r>
+      <w:r>
+        <w:rPr>
+          <w:lang w:val="en-US"/>
+        </w:rPr>
+        <w:t>CreateSudokuGuiController</w:t>
       </w:r>
       <w:r>
         <w:t>.</w:t>
       </w:r>
-    </w:p>
-    <w:p>
-      <w:pPr>
-        <w:pStyle w:val="a1"/>
-      </w:pPr>
-      <w:r>
-        <w:t>Была реализована мутация обменом. При выполнении мутации случайным образом выбирается блок, а затем внутри него выбираются две позиции. Если выбранные позиции различаются, значения в них меняются местами. Количество выполняемых перестановок зависит от заданной пользователем частоты мутации. Чем выше значение параметра, тем больше мутаций может быть произведено над генотипом.</w:t>
-      </w:r>
-    </w:p>
-    <w:p>
-      <w:pPr>
-        <w:pStyle w:val="a1"/>
+      <w:r>
+        <w:rPr>
+          <w:lang w:val="en-US"/>
+        </w:rPr>
+        <w:t>java</w:t>
+      </w:r>
+      <w:r>
+        <w:t xml:space="preserve">. Реализованы основное окно приложения и окно ручного ввода судоку. В результате был создан интерфейс, изображенный на рис. </w:t>
+      </w:r>
+      <w:r>
+        <w:t>3</w:t>
+      </w:r>
+      <w:r>
+        <w:t xml:space="preserve"> и рис. </w:t>
+      </w:r>
+      <w:r>
+        <w:t>4</w:t>
+      </w:r>
+      <w:r>
+        <w:t>.</w:t>
+      </w:r>
+    </w:p>
+    <w:p>
+      <w:pPr>
+        <w:pStyle w:val="a1"/>
+        <w:jc w:val="center"/>
+        <w:rPr>
+          <w:lang w:val="en-US"/>
+        </w:rPr>
+      </w:pPr>
+      <w:r>
+        <w:rPr>
+          <w:noProof/>
+        </w:rPr>
+        <w:drawing>
+          <wp:inline distT="0" distB="0" distL="0" distR="0" wp14:anchorId="49E80C60" wp14:editId="6C9A6009">
+            <wp:extent cx="3550257" cy="2880053"/>
+            <wp:effectExtent l="0" t="0" r="0" b="0"/>
+            <wp:docPr id="3" name="Рисунок 3"/>
+            <wp:cNvGraphicFramePr>
+              <a:graphicFrameLocks xmlns:a="http://schemas.openxmlformats.org/drawingml/2006/main" noChangeAspect="1"/>
+            </wp:cNvGraphicFramePr>
+            <a:graphic xmlns:a="http://schemas.openxmlformats.org/drawingml/2006/main">
+              <a:graphicData uri="http://schemas.openxmlformats.org/drawingml/2006/picture">
+                <pic:pic xmlns:pic="http://schemas.openxmlformats.org/drawingml/2006/picture">
+                  <pic:nvPicPr>
+                    <pic:cNvPr id="1" name=""/>
+                    <pic:cNvPicPr/>
+                  </pic:nvPicPr>
+                  <pic:blipFill>
+                    <a:blip r:embed="rId10"/>
+                    <a:stretch>
+                      <a:fillRect/>
+                    </a:stretch>
+                  </pic:blipFill>
+                  <pic:spPr>
+                    <a:xfrm>
+                      <a:off x="0" y="0"/>
+                      <a:ext cx="3558965" cy="2887118"/>
+                    </a:xfrm>
+                    <a:prstGeom prst="rect">
+                      <a:avLst/>
+                    </a:prstGeom>
+                  </pic:spPr>
+                </pic:pic>
+              </a:graphicData>
+            </a:graphic>
+          </wp:inline>
+        </w:drawing>
+      </w:r>
+    </w:p>
+    <w:p>
+      <w:pPr>
+        <w:pStyle w:val="af3"/>
+      </w:pPr>
+      <w:r>
+        <w:t xml:space="preserve">Рисунок </w:t>
+      </w:r>
+      <w:r>
+        <w:t>3</w:t>
+      </w:r>
+      <w:r>
+        <w:t xml:space="preserve"> –Графический интерфейс. Основное окно.</w:t>
+      </w:r>
+    </w:p>
+    <w:p>
+      <w:pPr>
+        <w:pStyle w:val="a1"/>
+        <w:jc w:val="center"/>
+        <w:rPr>
+          <w:lang w:val="en-US"/>
+        </w:rPr>
+      </w:pPr>
+      <w:r>
+        <w:rPr>
+          <w:noProof/>
+        </w:rPr>
+        <w:drawing>
+          <wp:inline distT="0" distB="0" distL="0" distR="0" wp14:anchorId="76114EBE" wp14:editId="39163AFB">
+            <wp:extent cx="2233437" cy="2820154"/>
+            <wp:effectExtent l="0" t="0" r="0" b="0"/>
+            <wp:docPr id="4" name="Рисунок 4"/>
+            <wp:cNvGraphicFramePr>
+              <a:graphicFrameLocks xmlns:a="http://schemas.openxmlformats.org/drawingml/2006/main" noChangeAspect="1"/>
+            </wp:cNvGraphicFramePr>
+            <a:graphic xmlns:a="http://schemas.openxmlformats.org/drawingml/2006/main">
+              <a:graphicData uri="http://schemas.openxmlformats.org/drawingml/2006/picture">
+                <pic:pic xmlns:pic="http://schemas.openxmlformats.org/drawingml/2006/picture">
+                  <pic:nvPicPr>
+                    <pic:cNvPr id="1" name=""/>
+                    <pic:cNvPicPr/>
+                  </pic:nvPicPr>
+                  <pic:blipFill>
+                    <a:blip r:embed="rId11"/>
+                    <a:stretch>
+                      <a:fillRect/>
+                    </a:stretch>
+                  </pic:blipFill>
+                  <pic:spPr>
+                    <a:xfrm>
+                      <a:off x="0" y="0"/>
+                      <a:ext cx="2245107" cy="2834889"/>
+                    </a:xfrm>
+                    <a:prstGeom prst="rect">
+                      <a:avLst/>
+                    </a:prstGeom>
+                  </pic:spPr>
+                </pic:pic>
+              </a:graphicData>
+            </a:graphic>
+          </wp:inline>
+        </w:drawing>
+      </w:r>
+    </w:p>
+    <w:p>
+      <w:pPr>
+        <w:pStyle w:val="af3"/>
+      </w:pPr>
+      <w:r>
+        <w:t>Рисунок 4 – Графический интерфейс. Окно ручного ввода судоку</w:t>
+      </w:r>
+    </w:p>
+    <w:p/>
+    <w:p>
+      <w:pPr>
+        <w:pStyle w:val="a1"/>
+        <w:jc w:val="center"/>
+      </w:pPr>
+    </w:p>
+    <w:p>
+      <w:pPr>
+        <w:pStyle w:val="a1"/>
+      </w:pPr>
+      <w:r>
+        <w:t xml:space="preserve"> </w:t>
+      </w:r>
+    </w:p>
+    <w:p>
+      <w:pPr>
+        <w:pStyle w:val="3"/>
+        <w:ind w:left="0"/>
+      </w:pPr>
+      <w:bookmarkStart w:id="14" w:name="_Toc234882191"/>
+      <w:r>
+        <w:t>2.</w:t>
+      </w:r>
+      <w:r>
+        <w:t>8</w:t>
+      </w:r>
+      <w:r>
+        <w:t>. Тестирование программы</w:t>
+      </w:r>
+      <w:bookmarkEnd w:id="14"/>
+    </w:p>
+    <w:p>
+      <w:pPr>
+        <w:pStyle w:val="a1"/>
+        <w:rPr>
+          <w:sz w:val="24"/>
+        </w:rPr>
       </w:pPr>
       <w:r>
         <w:lastRenderedPageBreak/>
-        <w:t>Для отбора особей для следующего поколения был использован ранжированный метод отбора. Перед выполнением отбора особи упорядочиваются по</w:t>
-      </w:r>
-      <w:r>
-        <w:t xml:space="preserve"> заранее вычисленному</w:t>
-      </w:r>
-      <w:r>
-        <w:t xml:space="preserve"> значению функции качества. После этого каждой особи назначается вес в зависимости от ее позиции в полученном списке. Особи с более высоким рангом получают больший вес и имеют более высокую вероятность быть выбранными для дальнейшего скрещивания.</w:t>
-      </w:r>
-    </w:p>
-    <w:p>
-      <w:pPr>
-        <w:pStyle w:val="a1"/>
-      </w:pPr>
-      <w:r>
-        <w:t xml:space="preserve">Скрещивание было реализовано при помощи равномерного обмена блоками между двумя родительскими особями. Для </w:t>
-      </w:r>
-      <w:proofErr w:type="gramStart"/>
-      <w:r>
-        <w:t>первого  потомка</w:t>
-      </w:r>
-      <w:proofErr w:type="gramEnd"/>
-      <w:r>
-        <w:t xml:space="preserve"> с равным шансом выбирался блок из первого или второго родителя, для второго выбирался блок ген</w:t>
-      </w:r>
-      <w:r>
-        <w:t>ов</w:t>
-      </w:r>
-      <w:r>
-        <w:t xml:space="preserve"> того родителя, </w:t>
-      </w:r>
-      <w:r>
-        <w:t>который не попал в первого потомка.</w:t>
-      </w:r>
-    </w:p>
-    <w:p>
-      <w:pPr>
-        <w:pStyle w:val="a1"/>
-      </w:pPr>
-      <w:r>
-        <w:t>Для того, чтобы алгоритм не сходился к единственному экстремуму, который может не являться верным решением, был реализован параллельный механизм образования ниш. На решения, находящиеся близко к друг другу накладывается штраф.</w:t>
-      </w:r>
-    </w:p>
-    <w:p>
-      <w:pPr>
-        <w:pStyle w:val="a1"/>
-      </w:pPr>
-    </w:p>
-    <w:p>
-      <w:pPr>
-        <w:pStyle w:val="a1"/>
-        <w:ind w:left="1418" w:firstLine="0"/>
-      </w:pPr>
-      <w:r>
-        <w:tab/>
-      </w:r>
+        <w:t>Было произведено тестирование программы на различных входных данных. Проверялась корректность загрузки и ручного ввода поля судоку, обработка пустых и некорректных значений, запуск алгоритма, обновление графика и отображение текущего состояния вычислений.</w:t>
+      </w:r>
+      <w:r>
+        <w:rPr>
+          <w:sz w:val="24"/>
+        </w:rPr>
+        <w:t xml:space="preserve"> </w:t>
+      </w:r>
+      <w:r>
+        <w:t>Работа алгоритма проверялась на судоку различной сложности. Для каждого запуска контролировались сохранение исходных значений, соответствие найденного решения правилам судоку и корректность критерия остановки. Дополнительно исследовалось влияние размера популяции, вероятности мутации, числа поколений и параметров штрафа за сходство на скорость поиска решения. Повторные запуски с одинаковым зерном генератора случайных чисел давали одинаковый результат, что подтвердило воспроизводимость вычислений.</w:t>
+      </w:r>
+      <w:r>
+        <w:t xml:space="preserve"> </w:t>
+      </w:r>
+      <w:r>
+        <w:t>В результате тестирования критических ошибок обнаружено не было.</w:t>
+      </w:r>
+    </w:p>
+    <w:p>
+      <w:pPr>
+        <w:pStyle w:val="a1"/>
+      </w:pPr>
+    </w:p>
+    <w:p>
+      <w:pPr>
+        <w:pStyle w:val="a1"/>
+        <w:jc w:val="center"/>
+      </w:pPr>
+    </w:p>
+    <w:p>
+      <w:pPr>
+        <w:pStyle w:val="a1"/>
+        <w:jc w:val="center"/>
+      </w:pPr>
+    </w:p>
+    <w:p>
+      <w:pPr>
+        <w:pStyle w:val="a1"/>
+      </w:pPr>
     </w:p>
     <w:p>
       <w:pPr>
@@ -4693,59 +5574,6 @@
           <w:bCs/>
         </w:rPr>
       </w:pPr>
-    </w:p>
-    <w:p>
-      <w:pPr>
-        <w:pStyle w:val="3"/>
-        <w:ind w:left="0"/>
-      </w:pPr>
-      <w:bookmarkStart w:id="13" w:name="_Toc234402010"/>
-      <w:r>
-        <w:t>2.</w:t>
-      </w:r>
-      <w:r>
-        <w:t>7</w:t>
-      </w:r>
-      <w:r>
-        <w:t>. Тестирование программы</w:t>
-      </w:r>
-      <w:bookmarkEnd w:id="13"/>
-    </w:p>
-    <w:p>
-      <w:pPr>
-        <w:pStyle w:val="3"/>
-        <w:ind w:left="0"/>
-      </w:pPr>
-    </w:p>
-    <w:p>
-      <w:pPr>
-        <w:pStyle w:val="3"/>
-        <w:ind w:left="0"/>
-      </w:pPr>
-      <w:bookmarkStart w:id="14" w:name="_Toc234402011"/>
-      <w:r>
-        <w:t>2.</w:t>
-      </w:r>
-      <w:r>
-        <w:t>8</w:t>
-      </w:r>
-      <w:r>
-        <w:t>. Создание отчета</w:t>
-      </w:r>
-      <w:bookmarkEnd w:id="14"/>
-    </w:p>
-    <w:p>
-      <w:pPr>
-        <w:pStyle w:val="a"/>
-        <w:numPr>
-          <w:ilvl w:val="0"/>
-          <w:numId w:val="0"/>
-        </w:numPr>
-        <w:rPr>
-          <w:b/>
-          <w:bCs/>
-        </w:rPr>
-      </w:pPr>
       <w:r>
         <w:rPr>
           <w:b/>
@@ -4762,7 +5590,7 @@
           <w:numId w:val="2"/>
         </w:numPr>
       </w:pPr>
-      <w:bookmarkStart w:id="15" w:name="_Toc234402012"/>
+      <w:bookmarkStart w:id="15" w:name="_Toc234882192"/>
       <w:r>
         <w:lastRenderedPageBreak/>
         <w:t>3 ИСПОЛЬЗУЕМЫЕ ТЕХНОЛОГИИ</w:t>
@@ -4855,16 +5683,8 @@
         <w:rPr>
           <w:lang w:val="en-US"/>
         </w:rPr>
-        <w:t xml:space="preserve">Jackson </w:t>
-      </w:r>
-      <w:proofErr w:type="spellStart"/>
-      <w:r>
-        <w:rPr>
-          <w:lang w:val="en-US"/>
-        </w:rPr>
-        <w:t>Databind</w:t>
-      </w:r>
-      <w:proofErr w:type="spellEnd"/>
+        <w:t>Jackson Databind</w:t>
+      </w:r>
     </w:p>
     <w:p>
       <w:pPr>
@@ -5029,7 +5849,7 @@
           <w:numId w:val="2"/>
         </w:numPr>
       </w:pPr>
-      <w:bookmarkStart w:id="16" w:name="_Toc234402013"/>
+      <w:bookmarkStart w:id="16" w:name="_Toc234882193"/>
       <w:r>
         <w:lastRenderedPageBreak/>
         <w:t>4 ОТЗЫВ РУКОВОДИТЕЛЯ</w:t>
@@ -5041,15 +5861,13 @@
         <w:pStyle w:val="a1"/>
       </w:pPr>
       <w:r>
-        <w:t>По результатам работы учебная практика оценена на &lt;</w:t>
-      </w:r>
-      <w:proofErr w:type="spellStart"/>
-      <w:r>
-        <w:t>ваша_оценка</w:t>
-      </w:r>
-      <w:proofErr w:type="spellEnd"/>
-      <w:r>
-        <w:t>&gt;.</w:t>
+        <w:t>По результатам работы учебная практика оценена на</w:t>
+      </w:r>
+      <w:r>
+        <w:t xml:space="preserve"> </w:t>
+      </w:r>
+      <w:r>
+        <w:t>.</w:t>
       </w:r>
       <w:r>
         <w:br w:type="page"/>
@@ -5063,7 +5881,7 @@
           <w:rFonts w:cs="Times New Roman"/>
         </w:rPr>
       </w:pPr>
-      <w:bookmarkStart w:id="17" w:name="_Toc234402014"/>
+      <w:bookmarkStart w:id="17" w:name="_Toc234882194"/>
       <w:r>
         <w:lastRenderedPageBreak/>
         <w:t>ЗАКЛЮЧЕНИЕ</w:t>
@@ -5075,7 +5893,34 @@
         <w:pStyle w:val="a1"/>
       </w:pPr>
       <w:r>
-        <w:t>Заключение содержит краткое описание результатов по каждой задаче, обозначенной в разделе «Постановка задачи», результаты работы в целом, согласно обозначенной цели и пр.</w:t>
+        <w:t>В результате выполнения учебной практики были изучены основные принципы работы генетических алгоритмов и особенности их применения для решения задач оптимизации, была разработана программа для решения судоку при помощи генетического алгоритма, а также создан интерактивный графический интерфейс</w:t>
+      </w:r>
+      <w:r>
+        <w:t xml:space="preserve"> </w:t>
+      </w:r>
+      <w:r>
+        <w:t>для взаимодействия пользователя с программой</w:t>
+      </w:r>
+      <w:r>
+        <w:t>.</w:t>
+      </w:r>
+      <w:r>
+        <w:t xml:space="preserve"> Было проведено тестирование программы и графического интерфейса на различных входных данных.</w:t>
+      </w:r>
+      <w:r>
+        <w:t xml:space="preserve"> </w:t>
+      </w:r>
+      <w:r>
+        <w:t xml:space="preserve">Исходный код программы размещён в репозитории GitHub </w:t>
+      </w:r>
+      <w:r>
+        <w:rPr>
+          <w:lang w:val="en-US"/>
+        </w:rPr>
+        <w:t>[2]</w:t>
+      </w:r>
+      <w:r>
+        <w:t>.</w:t>
       </w:r>
     </w:p>
     <w:p>
@@ -5098,7 +5943,7 @@
         </w:rPr>
       </w:pPr>
       <w:bookmarkStart w:id="18" w:name="_Toc73173388"/>
-      <w:bookmarkStart w:id="19" w:name="_Toc234402015"/>
+      <w:bookmarkStart w:id="19" w:name="_Toc234882195"/>
       <w:r>
         <w:rPr>
           <w:rFonts w:cs="Times New Roman"/>
@@ -5118,45 +5963,7 @@
         </w:numPr>
       </w:pPr>
       <w:r>
-        <w:rPr>
-          <w:lang w:val="en-US"/>
-        </w:rPr>
-        <w:t xml:space="preserve">The State of the </w:t>
-      </w:r>
-      <w:proofErr w:type="spellStart"/>
-      <w:r>
-        <w:rPr>
-          <w:lang w:val="en-US"/>
-        </w:rPr>
-        <w:t>Octoverse</w:t>
-      </w:r>
-      <w:proofErr w:type="spellEnd"/>
-      <w:r>
-        <w:rPr>
-          <w:lang w:val="en-US"/>
-        </w:rPr>
-        <w:t xml:space="preserve"> [</w:t>
-      </w:r>
-      <w:r>
-        <w:t>Электронный</w:t>
-      </w:r>
-      <w:r>
-        <w:rPr>
-          <w:lang w:val="en-US"/>
-        </w:rPr>
-        <w:t xml:space="preserve"> </w:t>
-      </w:r>
-      <w:r>
-        <w:t>ресурс</w:t>
-      </w:r>
-      <w:r>
-        <w:rPr>
-          <w:lang w:val="en-US"/>
-        </w:rPr>
-        <w:t xml:space="preserve">]. </w:t>
-      </w:r>
-      <w:r>
-        <w:t>URL: https://octoverse.github.com (дата обращения: 28.04.2021).</w:t>
+        <w:t>Панченко, Т. В. Генетические алгоритмы : учебно-методическое пособие / Т. В. Панченко ; под ред. Ю. Ю. Тарасевича. – Астрахань : Издательский дом «Астраханский университет», 2007. – 87, [3] с.</w:t>
       </w:r>
     </w:p>
     <w:p>
@@ -5168,54 +5975,42 @@
         </w:numPr>
       </w:pPr>
       <w:r>
-        <w:t>Бобкова, О.В., Давыдов, С.А., Ковалева, И.А., Плагиат как гражданское правонарушение / О.В. Бобкова, С.А. Давыдов, И.А. Ковалева // Патенты и лицензии. – 2016. – № 7. – С. 31-37.</w:t>
-      </w:r>
-    </w:p>
-    <w:p>
-      <w:pPr>
-        <w:outlineLvl w:val="0"/>
-        <w:rPr>
-          <w:rFonts w:cs="Times New Roman"/>
-          <w:color w:val="000000"/>
-          <w:szCs w:val="28"/>
-        </w:rPr>
-      </w:pPr>
-      <w:r>
-        <w:br w:type="page"/>
-      </w:r>
-    </w:p>
-    <w:p>
-      <w:pPr>
-        <w:pStyle w:val="2"/>
-        <w:ind w:left="0"/>
-        <w:rPr>
-          <w:rFonts w:cs="Times New Roman"/>
-        </w:rPr>
-      </w:pPr>
-      <w:bookmarkStart w:id="20" w:name="_Toc234402016"/>
-      <w:r>
-        <w:rPr>
-          <w:rFonts w:cs="Times New Roman"/>
-          <w:color w:val="000000"/>
-        </w:rPr>
-        <w:lastRenderedPageBreak/>
-        <w:t>ПРИЛОЖЕНИЕ А</w:t>
-      </w:r>
-      <w:bookmarkEnd w:id="20"/>
-    </w:p>
-    <w:p>
-      <w:pPr>
-        <w:pStyle w:val="a"/>
-        <w:numPr>
-          <w:ilvl w:val="0"/>
-          <w:numId w:val="0"/>
-        </w:numPr>
-      </w:pPr>
+        <w:t xml:space="preserve">Баженов, К. LETI_Practice: репозиторий </w:t>
+      </w:r>
+      <w:r>
+        <w:t xml:space="preserve">с </w:t>
+      </w:r>
+      <w:r>
+        <w:t>исходн</w:t>
+      </w:r>
+      <w:r>
+        <w:t>ым</w:t>
+      </w:r>
+      <w:r>
+        <w:t xml:space="preserve"> код</w:t>
+      </w:r>
+      <w:r>
+        <w:t>ом разработанной</w:t>
+      </w:r>
+      <w:r>
+        <w:t xml:space="preserve"> программы [Электронный ресурс]. – URL: </w:t>
+      </w:r>
+      <w:hyperlink r:id="rId12" w:tgtFrame="_new" w:history="1">
+        <w:r>
+          <w:rPr>
+            <w:rStyle w:val="a7"/>
+          </w:rPr>
+          <w:t>https://github.com/KonstantinBazhenov/LETI_Practice</w:t>
+        </w:r>
+      </w:hyperlink>
+      <w:r>
+        <w:t xml:space="preserve"> </w:t>
+      </w:r>
     </w:p>
     <w:sectPr>
-      <w:footerReference w:type="even" r:id="rId10"/>
-      <w:footerReference w:type="default" r:id="rId11"/>
-      <w:footerReference w:type="first" r:id="rId12"/>
+      <w:footerReference w:type="even" r:id="rId13"/>
+      <w:footerReference w:type="default" r:id="rId14"/>
+      <w:footerReference w:type="first" r:id="rId15"/>
       <w:pgSz w:w="11906" w:h="16838"/>
       <w:pgMar w:top="1134" w:right="850" w:bottom="1134" w:left="1701" w:header="0" w:footer="708" w:gutter="0"/>
       <w:cols w:space="720"/>
@@ -5609,6 +6404,119 @@
     </w:lvl>
   </w:abstractNum>
   <w:abstractNum w:abstractNumId="2" w15:restartNumberingAfterBreak="0">
+    <w:nsid w:val="18DD05D4"/>
+    <w:multiLevelType w:val="hybridMultilevel"/>
+    <w:tmpl w:val="833621E2"/>
+    <w:lvl w:ilvl="0" w:tplc="04190001">
+      <w:start w:val="1"/>
+      <w:numFmt w:val="bullet"/>
+      <w:lvlText w:val=""/>
+      <w:lvlJc w:val="left"/>
+      <w:pPr>
+        <w:ind w:left="1429" w:hanging="360"/>
+      </w:pPr>
+      <w:rPr>
+        <w:rFonts w:ascii="Symbol" w:hAnsi="Symbol" w:hint="default"/>
+      </w:rPr>
+    </w:lvl>
+    <w:lvl w:ilvl="1" w:tplc="04190003" w:tentative="1">
+      <w:start w:val="1"/>
+      <w:numFmt w:val="bullet"/>
+      <w:lvlText w:val="o"/>
+      <w:lvlJc w:val="left"/>
+      <w:pPr>
+        <w:ind w:left="2149" w:hanging="360"/>
+      </w:pPr>
+      <w:rPr>
+        <w:rFonts w:ascii="Courier New" w:hAnsi="Courier New" w:cs="Courier New" w:hint="default"/>
+      </w:rPr>
+    </w:lvl>
+    <w:lvl w:ilvl="2" w:tplc="04190005" w:tentative="1">
+      <w:start w:val="1"/>
+      <w:numFmt w:val="bullet"/>
+      <w:lvlText w:val=""/>
+      <w:lvlJc w:val="left"/>
+      <w:pPr>
+        <w:ind w:left="2869" w:hanging="360"/>
+      </w:pPr>
+      <w:rPr>
+        <w:rFonts w:ascii="Wingdings" w:hAnsi="Wingdings" w:hint="default"/>
+      </w:rPr>
+    </w:lvl>
+    <w:lvl w:ilvl="3" w:tplc="04190001" w:tentative="1">
+      <w:start w:val="1"/>
+      <w:numFmt w:val="bullet"/>
+      <w:lvlText w:val=""/>
+      <w:lvlJc w:val="left"/>
+      <w:pPr>
+        <w:ind w:left="3589" w:hanging="360"/>
+      </w:pPr>
+      <w:rPr>
+        <w:rFonts w:ascii="Symbol" w:hAnsi="Symbol" w:hint="default"/>
+      </w:rPr>
+    </w:lvl>
+    <w:lvl w:ilvl="4" w:tplc="04190003" w:tentative="1">
+      <w:start w:val="1"/>
+      <w:numFmt w:val="bullet"/>
+      <w:lvlText w:val="o"/>
+      <w:lvlJc w:val="left"/>
+      <w:pPr>
+        <w:ind w:left="4309" w:hanging="360"/>
+      </w:pPr>
+      <w:rPr>
+        <w:rFonts w:ascii="Courier New" w:hAnsi="Courier New" w:cs="Courier New" w:hint="default"/>
+      </w:rPr>
+    </w:lvl>
+    <w:lvl w:ilvl="5" w:tplc="04190005" w:tentative="1">
+      <w:start w:val="1"/>
+      <w:numFmt w:val="bullet"/>
+      <w:lvlText w:val=""/>
+      <w:lvlJc w:val="left"/>
+      <w:pPr>
+        <w:ind w:left="5029" w:hanging="360"/>
+      </w:pPr>
+      <w:rPr>
+        <w:rFonts w:ascii="Wingdings" w:hAnsi="Wingdings" w:hint="default"/>
+      </w:rPr>
+    </w:lvl>
+    <w:lvl w:ilvl="6" w:tplc="04190001" w:tentative="1">
+      <w:start w:val="1"/>
+      <w:numFmt w:val="bullet"/>
+      <w:lvlText w:val=""/>
+      <w:lvlJc w:val="left"/>
+      <w:pPr>
+        <w:ind w:left="5749" w:hanging="360"/>
+      </w:pPr>
+      <w:rPr>
+        <w:rFonts w:ascii="Symbol" w:hAnsi="Symbol" w:hint="default"/>
+      </w:rPr>
+    </w:lvl>
+    <w:lvl w:ilvl="7" w:tplc="04190003" w:tentative="1">
+      <w:start w:val="1"/>
+      <w:numFmt w:val="bullet"/>
+      <w:lvlText w:val="o"/>
+      <w:lvlJc w:val="left"/>
+      <w:pPr>
+        <w:ind w:left="6469" w:hanging="360"/>
+      </w:pPr>
+      <w:rPr>
+        <w:rFonts w:ascii="Courier New" w:hAnsi="Courier New" w:cs="Courier New" w:hint="default"/>
+      </w:rPr>
+    </w:lvl>
+    <w:lvl w:ilvl="8" w:tplc="04190005" w:tentative="1">
+      <w:start w:val="1"/>
+      <w:numFmt w:val="bullet"/>
+      <w:lvlText w:val=""/>
+      <w:lvlJc w:val="left"/>
+      <w:pPr>
+        <w:ind w:left="7189" w:hanging="360"/>
+      </w:pPr>
+      <w:rPr>
+        <w:rFonts w:ascii="Wingdings" w:hAnsi="Wingdings" w:hint="default"/>
+      </w:rPr>
+    </w:lvl>
+  </w:abstractNum>
+  <w:abstractNum w:abstractNumId="3" w15:restartNumberingAfterBreak="0">
     <w:nsid w:val="1A197856"/>
     <w:multiLevelType w:val="hybridMultilevel"/>
     <w:tmpl w:val="871A96D2"/>
@@ -5697,7 +6605,7 @@
       </w:pPr>
     </w:lvl>
   </w:abstractNum>
-  <w:abstractNum w:abstractNumId="3" w15:restartNumberingAfterBreak="0">
+  <w:abstractNum w:abstractNumId="4" w15:restartNumberingAfterBreak="0">
     <w:nsid w:val="1A9C174E"/>
     <w:multiLevelType w:val="multilevel"/>
     <w:tmpl w:val="605AB57C"/>
@@ -5838,7 +6746,7 @@
       </w:rPr>
     </w:lvl>
   </w:abstractNum>
-  <w:abstractNum w:abstractNumId="4" w15:restartNumberingAfterBreak="0">
+  <w:abstractNum w:abstractNumId="5" w15:restartNumberingAfterBreak="0">
     <w:nsid w:val="2917107A"/>
     <w:multiLevelType w:val="hybridMultilevel"/>
     <w:tmpl w:val="BC1E6C6A"/>
@@ -5927,7 +6835,7 @@
       </w:pPr>
     </w:lvl>
   </w:abstractNum>
-  <w:abstractNum w:abstractNumId="5" w15:restartNumberingAfterBreak="0">
+  <w:abstractNum w:abstractNumId="6" w15:restartNumberingAfterBreak="0">
     <w:nsid w:val="2B2845F5"/>
     <w:multiLevelType w:val="multilevel"/>
     <w:tmpl w:val="FEAC91CA"/>
@@ -6049,7 +6957,120 @@
       </w:pPr>
     </w:lvl>
   </w:abstractNum>
-  <w:abstractNum w:abstractNumId="6" w15:restartNumberingAfterBreak="0">
+  <w:abstractNum w:abstractNumId="7" w15:restartNumberingAfterBreak="0">
+    <w:nsid w:val="2FA1793E"/>
+    <w:multiLevelType w:val="hybridMultilevel"/>
+    <w:tmpl w:val="0FCC576E"/>
+    <w:lvl w:ilvl="0" w:tplc="04190001">
+      <w:start w:val="1"/>
+      <w:numFmt w:val="bullet"/>
+      <w:lvlText w:val=""/>
+      <w:lvlJc w:val="left"/>
+      <w:pPr>
+        <w:ind w:left="720" w:hanging="360"/>
+      </w:pPr>
+      <w:rPr>
+        <w:rFonts w:ascii="Symbol" w:hAnsi="Symbol" w:hint="default"/>
+      </w:rPr>
+    </w:lvl>
+    <w:lvl w:ilvl="1" w:tplc="04190003" w:tentative="1">
+      <w:start w:val="1"/>
+      <w:numFmt w:val="bullet"/>
+      <w:lvlText w:val="o"/>
+      <w:lvlJc w:val="left"/>
+      <w:pPr>
+        <w:ind w:left="1440" w:hanging="360"/>
+      </w:pPr>
+      <w:rPr>
+        <w:rFonts w:ascii="Courier New" w:hAnsi="Courier New" w:cs="Courier New" w:hint="default"/>
+      </w:rPr>
+    </w:lvl>
+    <w:lvl w:ilvl="2" w:tplc="04190005" w:tentative="1">
+      <w:start w:val="1"/>
+      <w:numFmt w:val="bullet"/>
+      <w:lvlText w:val=""/>
+      <w:lvlJc w:val="left"/>
+      <w:pPr>
+        <w:ind w:left="2160" w:hanging="360"/>
+      </w:pPr>
+      <w:rPr>
+        <w:rFonts w:ascii="Wingdings" w:hAnsi="Wingdings" w:hint="default"/>
+      </w:rPr>
+    </w:lvl>
+    <w:lvl w:ilvl="3" w:tplc="04190001" w:tentative="1">
+      <w:start w:val="1"/>
+      <w:numFmt w:val="bullet"/>
+      <w:lvlText w:val=""/>
+      <w:lvlJc w:val="left"/>
+      <w:pPr>
+        <w:ind w:left="2880" w:hanging="360"/>
+      </w:pPr>
+      <w:rPr>
+        <w:rFonts w:ascii="Symbol" w:hAnsi="Symbol" w:hint="default"/>
+      </w:rPr>
+    </w:lvl>
+    <w:lvl w:ilvl="4" w:tplc="04190003" w:tentative="1">
+      <w:start w:val="1"/>
+      <w:numFmt w:val="bullet"/>
+      <w:lvlText w:val="o"/>
+      <w:lvlJc w:val="left"/>
+      <w:pPr>
+        <w:ind w:left="3600" w:hanging="360"/>
+      </w:pPr>
+      <w:rPr>
+        <w:rFonts w:ascii="Courier New" w:hAnsi="Courier New" w:cs="Courier New" w:hint="default"/>
+      </w:rPr>
+    </w:lvl>
+    <w:lvl w:ilvl="5" w:tplc="04190005" w:tentative="1">
+      <w:start w:val="1"/>
+      <w:numFmt w:val="bullet"/>
+      <w:lvlText w:val=""/>
+      <w:lvlJc w:val="left"/>
+      <w:pPr>
+        <w:ind w:left="4320" w:hanging="360"/>
+      </w:pPr>
+      <w:rPr>
+        <w:rFonts w:ascii="Wingdings" w:hAnsi="Wingdings" w:hint="default"/>
+      </w:rPr>
+    </w:lvl>
+    <w:lvl w:ilvl="6" w:tplc="04190001" w:tentative="1">
+      <w:start w:val="1"/>
+      <w:numFmt w:val="bullet"/>
+      <w:lvlText w:val=""/>
+      <w:lvlJc w:val="left"/>
+      <w:pPr>
+        <w:ind w:left="5040" w:hanging="360"/>
+      </w:pPr>
+      <w:rPr>
+        <w:rFonts w:ascii="Symbol" w:hAnsi="Symbol" w:hint="default"/>
+      </w:rPr>
+    </w:lvl>
+    <w:lvl w:ilvl="7" w:tplc="04190003" w:tentative="1">
+      <w:start w:val="1"/>
+      <w:numFmt w:val="bullet"/>
+      <w:lvlText w:val="o"/>
+      <w:lvlJc w:val="left"/>
+      <w:pPr>
+        <w:ind w:left="5760" w:hanging="360"/>
+      </w:pPr>
+      <w:rPr>
+        <w:rFonts w:ascii="Courier New" w:hAnsi="Courier New" w:cs="Courier New" w:hint="default"/>
+      </w:rPr>
+    </w:lvl>
+    <w:lvl w:ilvl="8" w:tplc="04190005" w:tentative="1">
+      <w:start w:val="1"/>
+      <w:numFmt w:val="bullet"/>
+      <w:lvlText w:val=""/>
+      <w:lvlJc w:val="left"/>
+      <w:pPr>
+        <w:ind w:left="6480" w:hanging="360"/>
+      </w:pPr>
+      <w:rPr>
+        <w:rFonts w:ascii="Wingdings" w:hAnsi="Wingdings" w:hint="default"/>
+      </w:rPr>
+    </w:lvl>
+  </w:abstractNum>
+  <w:abstractNum w:abstractNumId="8" w15:restartNumberingAfterBreak="0">
     <w:nsid w:val="305A1F91"/>
     <w:multiLevelType w:val="multilevel"/>
     <w:tmpl w:val="52FE490E"/>
@@ -6162,7 +7183,7 @@
       </w:pPr>
     </w:lvl>
   </w:abstractNum>
-  <w:abstractNum w:abstractNumId="7" w15:restartNumberingAfterBreak="0">
+  <w:abstractNum w:abstractNumId="9" w15:restartNumberingAfterBreak="0">
     <w:nsid w:val="3C083600"/>
     <w:multiLevelType w:val="multilevel"/>
     <w:tmpl w:val="C6CCFC2E"/>
@@ -6285,7 +7306,7 @@
       </w:pPr>
     </w:lvl>
   </w:abstractNum>
-  <w:abstractNum w:abstractNumId="8" w15:restartNumberingAfterBreak="0">
+  <w:abstractNum w:abstractNumId="10" w15:restartNumberingAfterBreak="0">
     <w:nsid w:val="3E3E109B"/>
     <w:multiLevelType w:val="multilevel"/>
     <w:tmpl w:val="63D42AB0"/>
@@ -6434,7 +7455,179 @@
       </w:rPr>
     </w:lvl>
   </w:abstractNum>
-  <w:abstractNum w:abstractNumId="9" w15:restartNumberingAfterBreak="0">
+  <w:abstractNum w:abstractNumId="11" w15:restartNumberingAfterBreak="0">
+    <w:nsid w:val="438C0A27"/>
+    <w:multiLevelType w:val="hybridMultilevel"/>
+    <w:tmpl w:val="5680F4BC"/>
+    <w:lvl w:ilvl="0" w:tplc="0419000F">
+      <w:start w:val="1"/>
+      <w:numFmt w:val="decimal"/>
+      <w:lvlText w:val="%1."/>
+      <w:lvlJc w:val="left"/>
+      <w:pPr>
+        <w:ind w:left="1429" w:hanging="360"/>
+      </w:pPr>
+    </w:lvl>
+    <w:lvl w:ilvl="1" w:tplc="04190019" w:tentative="1">
+      <w:start w:val="1"/>
+      <w:numFmt w:val="lowerLetter"/>
+      <w:lvlText w:val="%2."/>
+      <w:lvlJc w:val="left"/>
+      <w:pPr>
+        <w:ind w:left="2149" w:hanging="360"/>
+      </w:pPr>
+    </w:lvl>
+    <w:lvl w:ilvl="2" w:tplc="0419001B" w:tentative="1">
+      <w:start w:val="1"/>
+      <w:numFmt w:val="lowerRoman"/>
+      <w:lvlText w:val="%3."/>
+      <w:lvlJc w:val="right"/>
+      <w:pPr>
+        <w:ind w:left="2869" w:hanging="180"/>
+      </w:pPr>
+    </w:lvl>
+    <w:lvl w:ilvl="3" w:tplc="0419000F" w:tentative="1">
+      <w:start w:val="1"/>
+      <w:numFmt w:val="decimal"/>
+      <w:lvlText w:val="%4."/>
+      <w:lvlJc w:val="left"/>
+      <w:pPr>
+        <w:ind w:left="3589" w:hanging="360"/>
+      </w:pPr>
+    </w:lvl>
+    <w:lvl w:ilvl="4" w:tplc="04190019" w:tentative="1">
+      <w:start w:val="1"/>
+      <w:numFmt w:val="lowerLetter"/>
+      <w:lvlText w:val="%5."/>
+      <w:lvlJc w:val="left"/>
+      <w:pPr>
+        <w:ind w:left="4309" w:hanging="360"/>
+      </w:pPr>
+    </w:lvl>
+    <w:lvl w:ilvl="5" w:tplc="0419001B" w:tentative="1">
+      <w:start w:val="1"/>
+      <w:numFmt w:val="lowerRoman"/>
+      <w:lvlText w:val="%6."/>
+      <w:lvlJc w:val="right"/>
+      <w:pPr>
+        <w:ind w:left="5029" w:hanging="180"/>
+      </w:pPr>
+    </w:lvl>
+    <w:lvl w:ilvl="6" w:tplc="0419000F" w:tentative="1">
+      <w:start w:val="1"/>
+      <w:numFmt w:val="decimal"/>
+      <w:lvlText w:val="%7."/>
+      <w:lvlJc w:val="left"/>
+      <w:pPr>
+        <w:ind w:left="5749" w:hanging="360"/>
+      </w:pPr>
+    </w:lvl>
+    <w:lvl w:ilvl="7" w:tplc="04190019" w:tentative="1">
+      <w:start w:val="1"/>
+      <w:numFmt w:val="lowerLetter"/>
+      <w:lvlText w:val="%8."/>
+      <w:lvlJc w:val="left"/>
+      <w:pPr>
+        <w:ind w:left="6469" w:hanging="360"/>
+      </w:pPr>
+    </w:lvl>
+    <w:lvl w:ilvl="8" w:tplc="0419001B" w:tentative="1">
+      <w:start w:val="1"/>
+      <w:numFmt w:val="lowerRoman"/>
+      <w:lvlText w:val="%9."/>
+      <w:lvlJc w:val="right"/>
+      <w:pPr>
+        <w:ind w:left="7189" w:hanging="180"/>
+      </w:pPr>
+    </w:lvl>
+  </w:abstractNum>
+  <w:abstractNum w:abstractNumId="12" w15:restartNumberingAfterBreak="0">
+    <w:nsid w:val="46514AB6"/>
+    <w:multiLevelType w:val="hybridMultilevel"/>
+    <w:tmpl w:val="E712323A"/>
+    <w:lvl w:ilvl="0" w:tplc="0419000F">
+      <w:start w:val="1"/>
+      <w:numFmt w:val="decimal"/>
+      <w:lvlText w:val="%1."/>
+      <w:lvlJc w:val="left"/>
+      <w:pPr>
+        <w:ind w:left="1429" w:hanging="360"/>
+      </w:pPr>
+    </w:lvl>
+    <w:lvl w:ilvl="1" w:tplc="04190019" w:tentative="1">
+      <w:start w:val="1"/>
+      <w:numFmt w:val="lowerLetter"/>
+      <w:lvlText w:val="%2."/>
+      <w:lvlJc w:val="left"/>
+      <w:pPr>
+        <w:ind w:left="2149" w:hanging="360"/>
+      </w:pPr>
+    </w:lvl>
+    <w:lvl w:ilvl="2" w:tplc="0419001B" w:tentative="1">
+      <w:start w:val="1"/>
+      <w:numFmt w:val="lowerRoman"/>
+      <w:lvlText w:val="%3."/>
+      <w:lvlJc w:val="right"/>
+      <w:pPr>
+        <w:ind w:left="2869" w:hanging="180"/>
+      </w:pPr>
+    </w:lvl>
+    <w:lvl w:ilvl="3" w:tplc="0419000F" w:tentative="1">
+      <w:start w:val="1"/>
+      <w:numFmt w:val="decimal"/>
+      <w:lvlText w:val="%4."/>
+      <w:lvlJc w:val="left"/>
+      <w:pPr>
+        <w:ind w:left="3589" w:hanging="360"/>
+      </w:pPr>
+    </w:lvl>
+    <w:lvl w:ilvl="4" w:tplc="04190019" w:tentative="1">
+      <w:start w:val="1"/>
+      <w:numFmt w:val="lowerLetter"/>
+      <w:lvlText w:val="%5."/>
+      <w:lvlJc w:val="left"/>
+      <w:pPr>
+        <w:ind w:left="4309" w:hanging="360"/>
+      </w:pPr>
+    </w:lvl>
+    <w:lvl w:ilvl="5" w:tplc="0419001B" w:tentative="1">
+      <w:start w:val="1"/>
+      <w:numFmt w:val="lowerRoman"/>
+      <w:lvlText w:val="%6."/>
+      <w:lvlJc w:val="right"/>
+      <w:pPr>
+        <w:ind w:left="5029" w:hanging="180"/>
+      </w:pPr>
+    </w:lvl>
+    <w:lvl w:ilvl="6" w:tplc="0419000F" w:tentative="1">
+      <w:start w:val="1"/>
+      <w:numFmt w:val="decimal"/>
+      <w:lvlText w:val="%7."/>
+      <w:lvlJc w:val="left"/>
+      <w:pPr>
+        <w:ind w:left="5749" w:hanging="360"/>
+      </w:pPr>
+    </w:lvl>
+    <w:lvl w:ilvl="7" w:tplc="04190019" w:tentative="1">
+      <w:start w:val="1"/>
+      <w:numFmt w:val="lowerLetter"/>
+      <w:lvlText w:val="%8."/>
+      <w:lvlJc w:val="left"/>
+      <w:pPr>
+        <w:ind w:left="6469" w:hanging="360"/>
+      </w:pPr>
+    </w:lvl>
+    <w:lvl w:ilvl="8" w:tplc="0419001B" w:tentative="1">
+      <w:start w:val="1"/>
+      <w:numFmt w:val="lowerRoman"/>
+      <w:lvlText w:val="%9."/>
+      <w:lvlJc w:val="right"/>
+      <w:pPr>
+        <w:ind w:left="7189" w:hanging="180"/>
+      </w:pPr>
+    </w:lvl>
+  </w:abstractNum>
+  <w:abstractNum w:abstractNumId="13" w15:restartNumberingAfterBreak="0">
     <w:nsid w:val="50F515C4"/>
     <w:multiLevelType w:val="hybridMultilevel"/>
     <w:tmpl w:val="F1C6E768"/>
@@ -6523,7 +7716,7 @@
       </w:pPr>
     </w:lvl>
   </w:abstractNum>
-  <w:abstractNum w:abstractNumId="10" w15:restartNumberingAfterBreak="0">
+  <w:abstractNum w:abstractNumId="14" w15:restartNumberingAfterBreak="0">
     <w:nsid w:val="55F72584"/>
     <w:multiLevelType w:val="hybridMultilevel"/>
     <w:tmpl w:val="F7922ED4"/>
@@ -6609,7 +7802,7 @@
       </w:pPr>
     </w:lvl>
   </w:abstractNum>
-  <w:abstractNum w:abstractNumId="11" w15:restartNumberingAfterBreak="0">
+  <w:abstractNum w:abstractNumId="15" w15:restartNumberingAfterBreak="0">
     <w:nsid w:val="5BC54FA6"/>
     <w:multiLevelType w:val="hybridMultilevel"/>
     <w:tmpl w:val="D814F466"/>
@@ -6698,7 +7891,7 @@
       </w:pPr>
     </w:lvl>
   </w:abstractNum>
-  <w:abstractNum w:abstractNumId="12" w15:restartNumberingAfterBreak="0">
+  <w:abstractNum w:abstractNumId="16" w15:restartNumberingAfterBreak="0">
     <w:nsid w:val="5C8D5244"/>
     <w:multiLevelType w:val="hybridMultilevel"/>
     <w:tmpl w:val="86BE9F28"/>
@@ -6787,7 +7980,7 @@
       </w:pPr>
     </w:lvl>
   </w:abstractNum>
-  <w:abstractNum w:abstractNumId="13" w15:restartNumberingAfterBreak="0">
+  <w:abstractNum w:abstractNumId="17" w15:restartNumberingAfterBreak="0">
     <w:nsid w:val="60FE3696"/>
     <w:multiLevelType w:val="hybridMultilevel"/>
     <w:tmpl w:val="B68CB2DA"/>
@@ -6876,7 +8069,7 @@
       </w:pPr>
     </w:lvl>
   </w:abstractNum>
-  <w:abstractNum w:abstractNumId="14" w15:restartNumberingAfterBreak="0">
+  <w:abstractNum w:abstractNumId="18" w15:restartNumberingAfterBreak="0">
     <w:nsid w:val="6435207E"/>
     <w:multiLevelType w:val="hybridMultilevel"/>
     <w:tmpl w:val="6AC699F0"/>
@@ -6966,48 +8159,60 @@
     </w:lvl>
   </w:abstractNum>
   <w:num w:numId="1">
-    <w:abstractNumId w:val="7"/>
+    <w:abstractNumId w:val="9"/>
   </w:num>
   <w:num w:numId="2">
     <w:abstractNumId w:val="1"/>
   </w:num>
   <w:num w:numId="3">
-    <w:abstractNumId w:val="6"/>
+    <w:abstractNumId w:val="8"/>
   </w:num>
   <w:num w:numId="4">
-    <w:abstractNumId w:val="3"/>
+    <w:abstractNumId w:val="4"/>
   </w:num>
   <w:num w:numId="5">
     <w:abstractNumId w:val="0"/>
   </w:num>
   <w:num w:numId="6">
+    <w:abstractNumId w:val="6"/>
+  </w:num>
+  <w:num w:numId="7">
+    <w:abstractNumId w:val="14"/>
+  </w:num>
+  <w:num w:numId="8">
+    <w:abstractNumId w:val="13"/>
+  </w:num>
+  <w:num w:numId="9">
     <w:abstractNumId w:val="5"/>
   </w:num>
-  <w:num w:numId="7">
+  <w:num w:numId="10">
     <w:abstractNumId w:val="10"/>
   </w:num>
-  <w:num w:numId="8">
-    <w:abstractNumId w:val="9"/>
-  </w:num>
-  <w:num w:numId="9">
-    <w:abstractNumId w:val="4"/>
-  </w:num>
-  <w:num w:numId="10">
-    <w:abstractNumId w:val="8"/>
-  </w:num>
   <w:num w:numId="11">
-    <w:abstractNumId w:val="13"/>
+    <w:abstractNumId w:val="17"/>
   </w:num>
   <w:num w:numId="12">
+    <w:abstractNumId w:val="3"/>
+  </w:num>
+  <w:num w:numId="13">
+    <w:abstractNumId w:val="15"/>
+  </w:num>
+  <w:num w:numId="14">
+    <w:abstractNumId w:val="18"/>
+  </w:num>
+  <w:num w:numId="15">
+    <w:abstractNumId w:val="16"/>
+  </w:num>
+  <w:num w:numId="16">
+    <w:abstractNumId w:val="11"/>
+  </w:num>
+  <w:num w:numId="17">
     <w:abstractNumId w:val="2"/>
   </w:num>
-  <w:num w:numId="13">
-    <w:abstractNumId w:val="11"/>
+  <w:num w:numId="18">
+    <w:abstractNumId w:val="7"/>
   </w:num>
-  <w:num w:numId="14">
-    <w:abstractNumId w:val="14"/>
-  </w:num>
-  <w:num w:numId="15">
+  <w:num w:numId="19">
     <w:abstractNumId w:val="12"/>
   </w:num>
 </w:numbering>
@@ -7964,6 +9169,22 @@
       <w:rFonts w:cs="Mangal"/>
     </w:rPr>
   </w:style>
+  <w:style w:type="paragraph" w:customStyle="1" w:styleId="pdq2pgselectionanchorcontainer">
+    <w:name w:val="pdq2pg_selectionanchorcontainer"/>
+    <w:basedOn w:val="a0"/>
+    <w:rsid w:val="00B26114"/>
+    <w:pPr>
+      <w:suppressAutoHyphens w:val="0"/>
+      <w:spacing w:before="100" w:beforeAutospacing="1" w:after="100" w:afterAutospacing="1"/>
+      <w:jc w:val="left"/>
+    </w:pPr>
+    <w:rPr>
+      <w:rFonts w:eastAsia="Times New Roman" w:cs="Times New Roman"/>
+      <w:sz w:val="24"/>
+      <w:szCs w:val="24"/>
+      <w:lang w:eastAsia="ru-RU" w:bidi="ar-SA"/>
+    </w:rPr>
+  </w:style>
 </w:styles>
 </file>
 

</xml_diff>